<commit_message>
updated core python (15-09-2026)
</commit_message>
<xml_diff>
--- a/core_python final_list.docx
+++ b/core_python final_list.docx
@@ -6,8 +6,13 @@
       <w:pPr>
         <w:pStyle w:val="NormalWeb"/>
       </w:pPr>
-      <w:r>
-        <w:t xml:space="preserve">Bilkul bhai </w:t>
+      <w:proofErr w:type="spellStart"/>
+      <w:r>
+        <w:t>Bilkul</w:t>
+      </w:r>
+      <w:proofErr w:type="spellEnd"/>
+      <w:r>
+        <w:t xml:space="preserve"> bhai </w:t>
       </w:r>
       <w:r>
         <w:rPr>
@@ -22,27 +27,161 @@
         <w:rPr>
           <w:rStyle w:val="Strong"/>
         </w:rPr>
-        <w:t>ab faltu ke random questions nahi.</w:t>
-      </w:r>
-      <w:r>
-        <w:t xml:space="preserve"> Main tujhe specifically </w:t>
-      </w:r>
-      <w:r>
-        <w:rPr>
-          <w:rStyle w:val="Strong"/>
-        </w:rPr>
-        <w:t>Python fresher / Python-Django backend interviews me practically pooche jaane wale coding/problem-solving questions</w:t>
-      </w:r>
-      <w:r>
-        <w:t xml:space="preserve"> ki list de raha hoon.</w:t>
-      </w:r>
-    </w:p>
-    <w:p>
-      <w:pPr>
-        <w:pStyle w:val="NormalWeb"/>
-      </w:pPr>
-      <w:r>
-        <w:t xml:space="preserve">Tera DSA already separate chal raha hai, isliye yahan </w:t>
+        <w:t xml:space="preserve">ab </w:t>
+      </w:r>
+      <w:proofErr w:type="spellStart"/>
+      <w:r>
+        <w:rPr>
+          <w:rStyle w:val="Strong"/>
+        </w:rPr>
+        <w:t>faltu</w:t>
+      </w:r>
+      <w:proofErr w:type="spellEnd"/>
+      <w:r>
+        <w:rPr>
+          <w:rStyle w:val="Strong"/>
+        </w:rPr>
+        <w:t xml:space="preserve"> </w:t>
+      </w:r>
+      <w:proofErr w:type="spellStart"/>
+      <w:r>
+        <w:rPr>
+          <w:rStyle w:val="Strong"/>
+        </w:rPr>
+        <w:t>ke</w:t>
+      </w:r>
+      <w:proofErr w:type="spellEnd"/>
+      <w:r>
+        <w:rPr>
+          <w:rStyle w:val="Strong"/>
+        </w:rPr>
+        <w:t xml:space="preserve"> random questions </w:t>
+      </w:r>
+      <w:proofErr w:type="spellStart"/>
+      <w:r>
+        <w:rPr>
+          <w:rStyle w:val="Strong"/>
+        </w:rPr>
+        <w:t>nahi</w:t>
+      </w:r>
+      <w:proofErr w:type="spellEnd"/>
+      <w:r>
+        <w:rPr>
+          <w:rStyle w:val="Strong"/>
+        </w:rPr>
+        <w:t>.</w:t>
+      </w:r>
+      <w:r>
+        <w:t xml:space="preserve"> Main </w:t>
+      </w:r>
+      <w:proofErr w:type="spellStart"/>
+      <w:r>
+        <w:t>tujhe</w:t>
+      </w:r>
+      <w:proofErr w:type="spellEnd"/>
+      <w:r>
+        <w:t xml:space="preserve"> specifically </w:t>
+      </w:r>
+      <w:r>
+        <w:rPr>
+          <w:rStyle w:val="Strong"/>
+        </w:rPr>
+        <w:t xml:space="preserve">Python fresher / Python-Django backend interviews me practically </w:t>
+      </w:r>
+      <w:proofErr w:type="spellStart"/>
+      <w:r>
+        <w:rPr>
+          <w:rStyle w:val="Strong"/>
+        </w:rPr>
+        <w:t>pooche</w:t>
+      </w:r>
+      <w:proofErr w:type="spellEnd"/>
+      <w:r>
+        <w:rPr>
+          <w:rStyle w:val="Strong"/>
+        </w:rPr>
+        <w:t xml:space="preserve"> </w:t>
+      </w:r>
+      <w:proofErr w:type="spellStart"/>
+      <w:r>
+        <w:rPr>
+          <w:rStyle w:val="Strong"/>
+        </w:rPr>
+        <w:t>jaane</w:t>
+      </w:r>
+      <w:proofErr w:type="spellEnd"/>
+      <w:r>
+        <w:rPr>
+          <w:rStyle w:val="Strong"/>
+        </w:rPr>
+        <w:t xml:space="preserve"> wale coding/problem-solving questions</w:t>
+      </w:r>
+      <w:r>
+        <w:t xml:space="preserve"> ki list de </w:t>
+      </w:r>
+      <w:proofErr w:type="spellStart"/>
+      <w:r>
+        <w:t>raha</w:t>
+      </w:r>
+      <w:proofErr w:type="spellEnd"/>
+      <w:r>
+        <w:t xml:space="preserve"> </w:t>
+      </w:r>
+      <w:proofErr w:type="spellStart"/>
+      <w:r>
+        <w:t>hoon</w:t>
+      </w:r>
+      <w:proofErr w:type="spellEnd"/>
+      <w:r>
+        <w:t>.</w:t>
+      </w:r>
+    </w:p>
+    <w:p>
+      <w:pPr>
+        <w:pStyle w:val="NormalWeb"/>
+      </w:pPr>
+      <w:r>
+        <w:t xml:space="preserve">Tera DSA already separate </w:t>
+      </w:r>
+      <w:proofErr w:type="spellStart"/>
+      <w:r>
+        <w:t>chal</w:t>
+      </w:r>
+      <w:proofErr w:type="spellEnd"/>
+      <w:r>
+        <w:t xml:space="preserve"> </w:t>
+      </w:r>
+      <w:proofErr w:type="spellStart"/>
+      <w:r>
+        <w:t>raha</w:t>
+      </w:r>
+      <w:proofErr w:type="spellEnd"/>
+      <w:r>
+        <w:t xml:space="preserve"> </w:t>
+      </w:r>
+      <w:proofErr w:type="spellStart"/>
+      <w:r>
+        <w:t>hai</w:t>
+      </w:r>
+      <w:proofErr w:type="spellEnd"/>
+      <w:r>
+        <w:t xml:space="preserve">, </w:t>
+      </w:r>
+      <w:proofErr w:type="spellStart"/>
+      <w:r>
+        <w:t>isliye</w:t>
+      </w:r>
+      <w:proofErr w:type="spellEnd"/>
+      <w:r>
+        <w:t xml:space="preserve"> </w:t>
+      </w:r>
+      <w:proofErr w:type="spellStart"/>
+      <w:r>
+        <w:t>yahan</w:t>
+      </w:r>
+      <w:proofErr w:type="spellEnd"/>
+      <w:r>
+        <w:t xml:space="preserve"> </w:t>
       </w:r>
       <w:r>
         <w:rPr>
@@ -51,13 +190,67 @@
         <w:t>Core Python coding</w:t>
       </w:r>
       <w:r>
-        <w:t xml:space="preserve"> me DSA ke same questions repeat nahi kar raha. Focus hoga: </w:t>
-      </w:r>
-      <w:r>
-        <w:rPr>
-          <w:rStyle w:val="Strong"/>
-        </w:rPr>
-        <w:t>Python syntax, data structures, functions, comprehensions, strings, dicts, exceptions, generators, decorators, OOP, files, output-based coding.</w:t>
+        <w:t xml:space="preserve"> me DSA </w:t>
+      </w:r>
+      <w:proofErr w:type="spellStart"/>
+      <w:r>
+        <w:t>ke</w:t>
+      </w:r>
+      <w:proofErr w:type="spellEnd"/>
+      <w:r>
+        <w:t xml:space="preserve"> same questions repeat </w:t>
+      </w:r>
+      <w:proofErr w:type="spellStart"/>
+      <w:r>
+        <w:t>nahi</w:t>
+      </w:r>
+      <w:proofErr w:type="spellEnd"/>
+      <w:r>
+        <w:t xml:space="preserve"> </w:t>
+      </w:r>
+      <w:proofErr w:type="spellStart"/>
+      <w:r>
+        <w:t>kar</w:t>
+      </w:r>
+      <w:proofErr w:type="spellEnd"/>
+      <w:r>
+        <w:t xml:space="preserve"> </w:t>
+      </w:r>
+      <w:proofErr w:type="spellStart"/>
+      <w:r>
+        <w:t>raha</w:t>
+      </w:r>
+      <w:proofErr w:type="spellEnd"/>
+      <w:r>
+        <w:t xml:space="preserve">. Focus </w:t>
+      </w:r>
+      <w:proofErr w:type="spellStart"/>
+      <w:r>
+        <w:t>hoga</w:t>
+      </w:r>
+      <w:proofErr w:type="spellEnd"/>
+      <w:r>
+        <w:t xml:space="preserve">: </w:t>
+      </w:r>
+      <w:r>
+        <w:rPr>
+          <w:rStyle w:val="Strong"/>
+        </w:rPr>
+        <w:t xml:space="preserve">Python syntax, data structures, functions, comprehensions, strings, </w:t>
+      </w:r>
+      <w:proofErr w:type="spellStart"/>
+      <w:r>
+        <w:rPr>
+          <w:rStyle w:val="Strong"/>
+        </w:rPr>
+        <w:t>dicts</w:t>
+      </w:r>
+      <w:proofErr w:type="spellEnd"/>
+      <w:r>
+        <w:rPr>
+          <w:rStyle w:val="Strong"/>
+        </w:rPr>
+        <w:t>, exceptions, generators, decorators, OOP, files, output-based coding.</w:t>
       </w:r>
     </w:p>
     <w:p>
@@ -98,13 +291,23 @@
         </w:rPr>
         <w:t xml:space="preserve">1. Reverse a string without using </w:t>
       </w:r>
+      <w:proofErr w:type="gramStart"/>
       <w:r>
         <w:rPr>
           <w:rStyle w:val="HTMLCode"/>
           <w:b/>
           <w:bCs/>
         </w:rPr>
-        <w:t>[::-1]</w:t>
+        <w:t>[::</w:t>
+      </w:r>
+      <w:proofErr w:type="gramEnd"/>
+      <w:r>
+        <w:rPr>
+          <w:rStyle w:val="HTMLCode"/>
+          <w:b/>
+          <w:bCs/>
+        </w:rPr>
+        <w:t>-1]</w:t>
       </w:r>
     </w:p>
     <w:p>
@@ -115,7 +318,21 @@
         <w:rPr>
           <w:rStyle w:val="HTMLCode"/>
         </w:rPr>
-        <w:t>"python" → "nohtyp"</w:t>
+        <w:t>"python" → "</w:t>
+      </w:r>
+      <w:proofErr w:type="spellStart"/>
+      <w:r>
+        <w:rPr>
+          <w:rStyle w:val="HTMLCode"/>
+        </w:rPr>
+        <w:t>nohtyp</w:t>
+      </w:r>
+      <w:proofErr w:type="spellEnd"/>
+      <w:r>
+        <w:rPr>
+          <w:rStyle w:val="HTMLCode"/>
+        </w:rPr>
+        <w:t>"</w:t>
       </w:r>
     </w:p>
     <w:p>
@@ -181,7 +398,21 @@
         <w:rPr>
           <w:rStyle w:val="HTMLCode"/>
         </w:rPr>
-        <w:t>"programming" → "progamin"</w:t>
+        <w:t>"programming" → "</w:t>
+      </w:r>
+      <w:proofErr w:type="spellStart"/>
+      <w:r>
+        <w:rPr>
+          <w:rStyle w:val="HTMLCode"/>
+        </w:rPr>
+        <w:t>progamin</w:t>
+      </w:r>
+      <w:proofErr w:type="spellEnd"/>
+      <w:r>
+        <w:rPr>
+          <w:rStyle w:val="HTMLCode"/>
+        </w:rPr>
+        <w:t>"</w:t>
       </w:r>
     </w:p>
     <w:p>
@@ -247,7 +478,49 @@
         <w:rPr>
           <w:rStyle w:val="HTMLCode"/>
         </w:rPr>
-        <w:t>"hello world" → "olleh dlrow"</w:t>
+        <w:t>"</w:t>
+      </w:r>
+      <w:proofErr w:type="gramStart"/>
+      <w:r>
+        <w:rPr>
+          <w:rStyle w:val="HTMLCode"/>
+        </w:rPr>
+        <w:t>hello</w:t>
+      </w:r>
+      <w:proofErr w:type="gramEnd"/>
+      <w:r>
+        <w:rPr>
+          <w:rStyle w:val="HTMLCode"/>
+        </w:rPr>
+        <w:t xml:space="preserve"> world" → "</w:t>
+      </w:r>
+      <w:proofErr w:type="spellStart"/>
+      <w:r>
+        <w:rPr>
+          <w:rStyle w:val="HTMLCode"/>
+        </w:rPr>
+        <w:t>olleh</w:t>
+      </w:r>
+      <w:proofErr w:type="spellEnd"/>
+      <w:r>
+        <w:rPr>
+          <w:rStyle w:val="HTMLCode"/>
+        </w:rPr>
+        <w:t xml:space="preserve"> </w:t>
+      </w:r>
+      <w:proofErr w:type="spellStart"/>
+      <w:r>
+        <w:rPr>
+          <w:rStyle w:val="HTMLCode"/>
+        </w:rPr>
+        <w:t>dlrow</w:t>
+      </w:r>
+      <w:proofErr w:type="spellEnd"/>
+      <w:r>
+        <w:rPr>
+          <w:rStyle w:val="HTMLCode"/>
+        </w:rPr>
+        <w:t>"</w:t>
       </w:r>
     </w:p>
     <w:p>
@@ -292,13 +565,23 @@
         </w:rPr>
         <w:t xml:space="preserve">12. Remove duplicates from a list without using </w:t>
       </w:r>
+      <w:proofErr w:type="gramStart"/>
       <w:r>
         <w:rPr>
           <w:rStyle w:val="HTMLCode"/>
           <w:b/>
           <w:bCs/>
         </w:rPr>
-        <w:t>set()</w:t>
+        <w:t>set(</w:t>
+      </w:r>
+      <w:proofErr w:type="gramEnd"/>
+      <w:r>
+        <w:rPr>
+          <w:rStyle w:val="HTMLCode"/>
+          <w:b/>
+          <w:bCs/>
+        </w:rPr>
+        <w:t>)</w:t>
       </w:r>
     </w:p>
     <w:p>
@@ -367,93 +650,29 @@
         </w:rPr>
         <w:t xml:space="preserve">17. Find maximum and minimum without </w:t>
       </w:r>
+      <w:proofErr w:type="gramStart"/>
       <w:r>
         <w:rPr>
           <w:rStyle w:val="HTMLCode"/>
           <w:b/>
           <w:bCs/>
         </w:rPr>
-        <w:t>max()</w:t>
-      </w:r>
-      <w:r>
-        <w:rPr>
-          <w:rStyle w:val="Strong"/>
-        </w:rPr>
-        <w:t xml:space="preserve"> / </w:t>
-      </w:r>
+        <w:t>max(</w:t>
+      </w:r>
+      <w:proofErr w:type="gramEnd"/>
       <w:r>
         <w:rPr>
           <w:rStyle w:val="HTMLCode"/>
           <w:b/>
           <w:bCs/>
         </w:rPr>
-        <w:t>min()</w:t>
-      </w:r>
-    </w:p>
-    <w:p>
-      <w:pPr>
-        <w:pStyle w:val="NormalWeb"/>
-      </w:pPr>
-      <w:r>
-        <w:rPr>
-          <w:rStyle w:val="Strong"/>
-        </w:rPr>
-        <w:t>18. Find second largest element</w:t>
-      </w:r>
-    </w:p>
-    <w:p>
-      <w:pPr>
-        <w:pStyle w:val="NormalWeb"/>
-      </w:pPr>
-      <w:r>
-        <w:rPr>
-          <w:rStyle w:val="Strong"/>
-        </w:rPr>
-        <w:t>19. Find second smallest element</w:t>
-      </w:r>
-    </w:p>
-    <w:p>
-      <w:pPr>
-        <w:pStyle w:val="NormalWeb"/>
-      </w:pPr>
-      <w:r>
-        <w:rPr>
-          <w:rStyle w:val="Strong"/>
-        </w:rPr>
-        <w:t>20. Separate even and odd numbers</w:t>
-      </w:r>
-    </w:p>
-    <w:p>
-      <w:pPr>
-        <w:pStyle w:val="NormalWeb"/>
-      </w:pPr>
-      <w:r>
-        <w:rPr>
-          <w:rStyle w:val="Strong"/>
-        </w:rPr>
-        <w:t>21. Count even and odd numbers</w:t>
-      </w:r>
-    </w:p>
-    <w:p>
-      <w:pPr>
-        <w:pStyle w:val="NormalWeb"/>
-      </w:pPr>
-      <w:r>
-        <w:rPr>
-          <w:rStyle w:val="Strong"/>
-        </w:rPr>
-        <w:t>22. Move all zeroes to the end</w:t>
-      </w:r>
-    </w:p>
-    <w:p>
-      <w:pPr>
-        <w:pStyle w:val="NormalWeb"/>
-      </w:pPr>
-      <w:r>
-        <w:rPr>
-          <w:rStyle w:val="Strong"/>
-        </w:rPr>
-        <w:t xml:space="preserve">23. Reverse a list without </w:t>
+        <w:t>)</w:t>
+      </w:r>
+      <w:r>
+        <w:rPr>
+          <w:rStyle w:val="Strong"/>
+        </w:rPr>
+        <w:t xml:space="preserve"> / </w:t>
       </w:r>
       <w:r>
         <w:rPr>
@@ -461,7 +680,91 @@
           <w:b/>
           <w:bCs/>
         </w:rPr>
-        <w:t>reverse()</w:t>
+        <w:t>min()</w:t>
+      </w:r>
+    </w:p>
+    <w:p>
+      <w:pPr>
+        <w:pStyle w:val="NormalWeb"/>
+      </w:pPr>
+      <w:r>
+        <w:rPr>
+          <w:rStyle w:val="Strong"/>
+        </w:rPr>
+        <w:t>18. Find second largest element</w:t>
+      </w:r>
+    </w:p>
+    <w:p>
+      <w:pPr>
+        <w:pStyle w:val="NormalWeb"/>
+      </w:pPr>
+      <w:r>
+        <w:rPr>
+          <w:rStyle w:val="Strong"/>
+        </w:rPr>
+        <w:t>19. Find second smallest element</w:t>
+      </w:r>
+    </w:p>
+    <w:p>
+      <w:pPr>
+        <w:pStyle w:val="NormalWeb"/>
+      </w:pPr>
+      <w:r>
+        <w:rPr>
+          <w:rStyle w:val="Strong"/>
+        </w:rPr>
+        <w:t>20. Separate even and odd numbers</w:t>
+      </w:r>
+    </w:p>
+    <w:p>
+      <w:pPr>
+        <w:pStyle w:val="NormalWeb"/>
+      </w:pPr>
+      <w:r>
+        <w:rPr>
+          <w:rStyle w:val="Strong"/>
+        </w:rPr>
+        <w:t>21. Count even and odd numbers</w:t>
+      </w:r>
+    </w:p>
+    <w:p>
+      <w:pPr>
+        <w:pStyle w:val="NormalWeb"/>
+      </w:pPr>
+      <w:r>
+        <w:rPr>
+          <w:rStyle w:val="Strong"/>
+        </w:rPr>
+        <w:t>22. Move all zeroes to the end</w:t>
+      </w:r>
+    </w:p>
+    <w:p>
+      <w:pPr>
+        <w:pStyle w:val="NormalWeb"/>
+      </w:pPr>
+      <w:r>
+        <w:rPr>
+          <w:rStyle w:val="Strong"/>
+        </w:rPr>
+        <w:t xml:space="preserve">23. Reverse a list without </w:t>
+      </w:r>
+      <w:proofErr w:type="gramStart"/>
+      <w:r>
+        <w:rPr>
+          <w:rStyle w:val="HTMLCode"/>
+          <w:b/>
+          <w:bCs/>
+        </w:rPr>
+        <w:t>reverse(</w:t>
+      </w:r>
+      <w:proofErr w:type="gramEnd"/>
+      <w:r>
+        <w:rPr>
+          <w:rStyle w:val="HTMLCode"/>
+          <w:b/>
+          <w:bCs/>
+        </w:rPr>
+        <w:t>)</w:t>
       </w:r>
     </w:p>
     <w:p>
@@ -657,7 +960,21 @@
         <w:rPr>
           <w:rStyle w:val="HTMLCode"/>
         </w:rPr>
-        <w:t>["cat","dog","apple","bat"]</w:t>
+        <w:t>["</w:t>
+      </w:r>
+      <w:proofErr w:type="spellStart"/>
+      <w:r>
+        <w:rPr>
+          <w:rStyle w:val="HTMLCode"/>
+        </w:rPr>
+        <w:t>cat","dog","apple","bat</w:t>
+      </w:r>
+      <w:proofErr w:type="spellEnd"/>
+      <w:r>
+        <w:rPr>
+          <w:rStyle w:val="HTMLCode"/>
+        </w:rPr>
+        <w:t>"]</w:t>
       </w:r>
     </w:p>
     <w:p>
@@ -668,7 +985,35 @@
         <w:rPr>
           <w:rStyle w:val="HTMLCode"/>
         </w:rPr>
-        <w:t>→ {3:["cat","dog","bat"], 5:["apple"]}</w:t>
+        <w:t>→ {</w:t>
+      </w:r>
+      <w:proofErr w:type="gramStart"/>
+      <w:r>
+        <w:rPr>
+          <w:rStyle w:val="HTMLCode"/>
+        </w:rPr>
+        <w:t>3:[</w:t>
+      </w:r>
+      <w:proofErr w:type="gramEnd"/>
+      <w:r>
+        <w:rPr>
+          <w:rStyle w:val="HTMLCode"/>
+        </w:rPr>
+        <w:t>"</w:t>
+      </w:r>
+      <w:proofErr w:type="spellStart"/>
+      <w:r>
+        <w:rPr>
+          <w:rStyle w:val="HTMLCode"/>
+        </w:rPr>
+        <w:t>cat","dog","bat</w:t>
+      </w:r>
+      <w:proofErr w:type="spellEnd"/>
+      <w:r>
+        <w:rPr>
+          <w:rStyle w:val="HTMLCode"/>
+        </w:rPr>
+        <w:t>"], 5:["apple"]}</w:t>
       </w:r>
     </w:p>
     <w:p>
@@ -704,7 +1049,21 @@
         <w:rPr>
           <w:rStyle w:val="HTMLCode"/>
         </w:rPr>
-        <w:t>keys = ["a","b","c"]</w:t>
+        <w:t>keys = ["</w:t>
+      </w:r>
+      <w:proofErr w:type="spellStart"/>
+      <w:r>
+        <w:rPr>
+          <w:rStyle w:val="HTMLCode"/>
+        </w:rPr>
+        <w:t>a","b","c</w:t>
+      </w:r>
+      <w:proofErr w:type="spellEnd"/>
+      <w:r>
+        <w:rPr>
+          <w:rStyle w:val="HTMLCode"/>
+        </w:rPr>
+        <w:t>"]</w:t>
       </w:r>
     </w:p>
     <w:p>
@@ -1141,8 +1500,18 @@
           <w:b/>
           <w:bCs/>
         </w:rPr>
-        <w:t>*args</w:t>
-      </w:r>
+        <w:t>*</w:t>
+      </w:r>
+      <w:proofErr w:type="spellStart"/>
+      <w:r>
+        <w:rPr>
+          <w:rStyle w:val="HTMLCode"/>
+          <w:b/>
+          <w:bCs/>
+        </w:rPr>
+        <w:t>args</w:t>
+      </w:r>
+      <w:proofErr w:type="spellEnd"/>
     </w:p>
     <w:p>
       <w:pPr>
@@ -1221,18 +1590,28 @@
           </mc:Fallback>
         </mc:AlternateContent>
       </w:r>
+      <w:proofErr w:type="spellStart"/>
       <w:r>
         <w:rPr>
           <w:rStyle w:val="11"/>
         </w:rPr>
-        <w:t>sum_all</w:t>
-      </w:r>
+        <w:t>sum_</w:t>
+      </w:r>
+      <w:proofErr w:type="gramStart"/>
+      <w:r>
+        <w:rPr>
+          <w:rStyle w:val="11"/>
+        </w:rPr>
+        <w:t>all</w:t>
+      </w:r>
+      <w:proofErr w:type="spellEnd"/>
       <w:r>
         <w:rPr>
           <w:rStyle w:val="HTMLCode"/>
         </w:rPr>
         <w:t>(</w:t>
       </w:r>
+      <w:proofErr w:type="gramEnd"/>
       <w:r>
         <w:rPr>
           <w:rStyle w:val="y"/>
@@ -1311,32 +1690,28 @@
           <w:b/>
           <w:bCs/>
         </w:rPr>
-        <w:t>**kwargs</w:t>
-      </w:r>
-    </w:p>
-    <w:p>
-      <w:pPr>
-        <w:pStyle w:val="NormalWeb"/>
-      </w:pPr>
-      <w:r>
-        <w:rPr>
-          <w:rStyle w:val="Strong"/>
-        </w:rPr>
-        <w:t xml:space="preserve">47. Write a function that accepts both </w:t>
-      </w:r>
+        <w:t>**</w:t>
+      </w:r>
+      <w:proofErr w:type="spellStart"/>
       <w:r>
         <w:rPr>
           <w:rStyle w:val="HTMLCode"/>
           <w:b/>
           <w:bCs/>
         </w:rPr>
-        <w:t>*args</w:t>
-      </w:r>
-      <w:r>
-        <w:rPr>
-          <w:rStyle w:val="Strong"/>
-        </w:rPr>
-        <w:t xml:space="preserve"> and </w:t>
+        <w:t>kwargs</w:t>
+      </w:r>
+      <w:proofErr w:type="spellEnd"/>
+    </w:p>
+    <w:p>
+      <w:pPr>
+        <w:pStyle w:val="NormalWeb"/>
+      </w:pPr>
+      <w:r>
+        <w:rPr>
+          <w:rStyle w:val="Strong"/>
+        </w:rPr>
+        <w:t xml:space="preserve">47. Write a function that accepts both </w:t>
       </w:r>
       <w:r>
         <w:rPr>
@@ -1344,156 +1719,23 @@
           <w:b/>
           <w:bCs/>
         </w:rPr>
-        <w:t>**kwargs</w:t>
-      </w:r>
-    </w:p>
-    <w:p>
-      <w:pPr>
-        <w:pStyle w:val="NormalWeb"/>
-      </w:pPr>
-      <w:r>
-        <w:rPr>
-          <w:rStyle w:val="Strong"/>
-        </w:rPr>
-        <w:t>48. Write a lambda function to square a number</w:t>
-      </w:r>
-    </w:p>
-    <w:p>
-      <w:pPr>
-        <w:pStyle w:val="NormalWeb"/>
-      </w:pPr>
-      <w:r>
-        <w:rPr>
-          <w:rStyle w:val="Strong"/>
-        </w:rPr>
-        <w:t>49. Sort a list of tuples using lambda</w:t>
-      </w:r>
-    </w:p>
-    <w:p>
-      <w:pPr>
-        <w:pStyle w:val="HTMLPreformatted"/>
-      </w:pPr>
-      <w:r>
-        <w:rPr>
-          <w:rStyle w:val="HTMLCode"/>
-        </w:rPr>
-        <w:t>[(</w:t>
-      </w:r>
-      <w:r>
-        <w:rPr>
-          <w:rStyle w:val="y"/>
-        </w:rPr>
-        <w:t>1</w:t>
-      </w:r>
-      <w:r>
-        <w:rPr>
-          <w:rStyle w:val="HTMLCode"/>
-        </w:rPr>
-        <w:t>,</w:t>
-      </w:r>
-      <w:r>
-        <w:rPr>
-          <w:rStyle w:val="y"/>
-        </w:rPr>
-        <w:t>3</w:t>
-      </w:r>
-      <w:r>
-        <w:rPr>
-          <w:rStyle w:val="HTMLCode"/>
-        </w:rPr>
-        <w:t>), (</w:t>
-      </w:r>
-      <w:r>
-        <w:rPr>
-          <w:rStyle w:val="y"/>
-        </w:rPr>
-        <w:t>2</w:t>
-      </w:r>
-      <w:r>
-        <w:rPr>
-          <w:rStyle w:val="HTMLCode"/>
-        </w:rPr>
-        <w:t>,</w:t>
-      </w:r>
-      <w:r>
-        <w:rPr>
-          <w:rStyle w:val="y"/>
-        </w:rPr>
-        <w:t>1</w:t>
-      </w:r>
-      <w:r>
-        <w:rPr>
-          <w:rStyle w:val="HTMLCode"/>
-        </w:rPr>
-        <w:t>), (</w:t>
-      </w:r>
-      <w:r>
-        <w:rPr>
-          <w:rStyle w:val="y"/>
-        </w:rPr>
-        <w:t>4</w:t>
-      </w:r>
-      <w:r>
-        <w:rPr>
-          <w:rStyle w:val="HTMLCode"/>
-        </w:rPr>
-        <w:t>,</w:t>
-      </w:r>
-      <w:r>
-        <w:rPr>
-          <w:rStyle w:val="y"/>
-        </w:rPr>
-        <w:t>2</w:t>
-      </w:r>
-      <w:r>
-        <w:rPr>
-          <w:rStyle w:val="HTMLCode"/>
-        </w:rPr>
-        <w:t>)]</w:t>
-      </w:r>
-    </w:p>
-    <w:p>
-      <w:pPr>
-        <w:pStyle w:val="NormalWeb"/>
-      </w:pPr>
-      <w:r>
-        <w:t>Sort by second element.</w:t>
-      </w:r>
-    </w:p>
-    <w:p>
-      <w:pPr>
-        <w:pStyle w:val="NormalWeb"/>
-      </w:pPr>
-      <w:r>
-        <w:rPr>
-          <w:rStyle w:val="Strong"/>
-        </w:rPr>
-        <w:t xml:space="preserve">50. Use </w:t>
-      </w:r>
+        <w:t>*</w:t>
+      </w:r>
+      <w:proofErr w:type="spellStart"/>
       <w:r>
         <w:rPr>
           <w:rStyle w:val="HTMLCode"/>
           <w:b/>
           <w:bCs/>
         </w:rPr>
-        <w:t>map()</w:t>
-      </w:r>
-      <w:r>
-        <w:rPr>
-          <w:rStyle w:val="Strong"/>
-        </w:rPr>
-        <w:t xml:space="preserve"> to square all numbers</w:t>
-      </w:r>
-    </w:p>
-    <w:p>
-      <w:pPr>
-        <w:pStyle w:val="NormalWeb"/>
-      </w:pPr>
-      <w:r>
-        <w:rPr>
-          <w:rStyle w:val="Strong"/>
-        </w:rPr>
-        <w:t xml:space="preserve">51. Use </w:t>
+        <w:t>args</w:t>
+      </w:r>
+      <w:proofErr w:type="spellEnd"/>
+      <w:r>
+        <w:rPr>
+          <w:rStyle w:val="Strong"/>
+        </w:rPr>
+        <w:t xml:space="preserve"> and </w:t>
       </w:r>
       <w:r>
         <w:rPr>
@@ -1501,32 +1743,229 @@
           <w:b/>
           <w:bCs/>
         </w:rPr>
-        <w:t>filter()</w:t>
-      </w:r>
-      <w:r>
-        <w:rPr>
-          <w:rStyle w:val="Strong"/>
-        </w:rPr>
-        <w:t xml:space="preserve"> to get even numbers</w:t>
-      </w:r>
-    </w:p>
-    <w:p>
-      <w:pPr>
-        <w:pStyle w:val="NormalWeb"/>
-      </w:pPr>
-      <w:r>
-        <w:rPr>
-          <w:rStyle w:val="Strong"/>
-        </w:rPr>
-        <w:t xml:space="preserve">52. Use </w:t>
-      </w:r>
+        <w:t>**</w:t>
+      </w:r>
+      <w:proofErr w:type="spellStart"/>
       <w:r>
         <w:rPr>
           <w:rStyle w:val="HTMLCode"/>
           <w:b/>
           <w:bCs/>
         </w:rPr>
-        <w:t>reduce()</w:t>
+        <w:t>kwargs</w:t>
+      </w:r>
+      <w:proofErr w:type="spellEnd"/>
+    </w:p>
+    <w:p>
+      <w:pPr>
+        <w:pStyle w:val="NormalWeb"/>
+      </w:pPr>
+      <w:r>
+        <w:rPr>
+          <w:rStyle w:val="Strong"/>
+        </w:rPr>
+        <w:t>48. Write a lambda function to square a number</w:t>
+      </w:r>
+    </w:p>
+    <w:p>
+      <w:pPr>
+        <w:pStyle w:val="NormalWeb"/>
+      </w:pPr>
+      <w:r>
+        <w:rPr>
+          <w:rStyle w:val="Strong"/>
+        </w:rPr>
+        <w:t>49. Sort a list of tuples using lambda</w:t>
+      </w:r>
+    </w:p>
+    <w:p>
+      <w:pPr>
+        <w:pStyle w:val="HTMLPreformatted"/>
+      </w:pPr>
+      <w:r>
+        <w:rPr>
+          <w:rStyle w:val="HTMLCode"/>
+        </w:rPr>
+        <w:t>[(</w:t>
+      </w:r>
+      <w:r>
+        <w:rPr>
+          <w:rStyle w:val="y"/>
+        </w:rPr>
+        <w:t>1</w:t>
+      </w:r>
+      <w:r>
+        <w:rPr>
+          <w:rStyle w:val="HTMLCode"/>
+        </w:rPr>
+        <w:t>,</w:t>
+      </w:r>
+      <w:r>
+        <w:rPr>
+          <w:rStyle w:val="y"/>
+        </w:rPr>
+        <w:t>3</w:t>
+      </w:r>
+      <w:r>
+        <w:rPr>
+          <w:rStyle w:val="HTMLCode"/>
+        </w:rPr>
+        <w:t>), (</w:t>
+      </w:r>
+      <w:r>
+        <w:rPr>
+          <w:rStyle w:val="y"/>
+        </w:rPr>
+        <w:t>2</w:t>
+      </w:r>
+      <w:r>
+        <w:rPr>
+          <w:rStyle w:val="HTMLCode"/>
+        </w:rPr>
+        <w:t>,</w:t>
+      </w:r>
+      <w:r>
+        <w:rPr>
+          <w:rStyle w:val="y"/>
+        </w:rPr>
+        <w:t>1</w:t>
+      </w:r>
+      <w:r>
+        <w:rPr>
+          <w:rStyle w:val="HTMLCode"/>
+        </w:rPr>
+        <w:t>), (</w:t>
+      </w:r>
+      <w:r>
+        <w:rPr>
+          <w:rStyle w:val="y"/>
+        </w:rPr>
+        <w:t>4</w:t>
+      </w:r>
+      <w:r>
+        <w:rPr>
+          <w:rStyle w:val="HTMLCode"/>
+        </w:rPr>
+        <w:t>,</w:t>
+      </w:r>
+      <w:r>
+        <w:rPr>
+          <w:rStyle w:val="y"/>
+        </w:rPr>
+        <w:t>2</w:t>
+      </w:r>
+      <w:r>
+        <w:rPr>
+          <w:rStyle w:val="HTMLCode"/>
+        </w:rPr>
+        <w:t>)]</w:t>
+      </w:r>
+    </w:p>
+    <w:p>
+      <w:pPr>
+        <w:pStyle w:val="NormalWeb"/>
+      </w:pPr>
+      <w:r>
+        <w:t>Sort by second element.</w:t>
+      </w:r>
+    </w:p>
+    <w:p>
+      <w:pPr>
+        <w:pStyle w:val="NormalWeb"/>
+      </w:pPr>
+      <w:r>
+        <w:rPr>
+          <w:rStyle w:val="Strong"/>
+        </w:rPr>
+        <w:t xml:space="preserve">50. Use </w:t>
+      </w:r>
+      <w:proofErr w:type="gramStart"/>
+      <w:r>
+        <w:rPr>
+          <w:rStyle w:val="HTMLCode"/>
+          <w:b/>
+          <w:bCs/>
+        </w:rPr>
+        <w:t>map(</w:t>
+      </w:r>
+      <w:proofErr w:type="gramEnd"/>
+      <w:r>
+        <w:rPr>
+          <w:rStyle w:val="HTMLCode"/>
+          <w:b/>
+          <w:bCs/>
+        </w:rPr>
+        <w:t>)</w:t>
+      </w:r>
+      <w:r>
+        <w:rPr>
+          <w:rStyle w:val="Strong"/>
+        </w:rPr>
+        <w:t xml:space="preserve"> to square all numbers</w:t>
+      </w:r>
+    </w:p>
+    <w:p>
+      <w:pPr>
+        <w:pStyle w:val="NormalWeb"/>
+      </w:pPr>
+      <w:r>
+        <w:rPr>
+          <w:rStyle w:val="Strong"/>
+        </w:rPr>
+        <w:t xml:space="preserve">51. Use </w:t>
+      </w:r>
+      <w:proofErr w:type="gramStart"/>
+      <w:r>
+        <w:rPr>
+          <w:rStyle w:val="HTMLCode"/>
+          <w:b/>
+          <w:bCs/>
+        </w:rPr>
+        <w:t>filter(</w:t>
+      </w:r>
+      <w:proofErr w:type="gramEnd"/>
+      <w:r>
+        <w:rPr>
+          <w:rStyle w:val="HTMLCode"/>
+          <w:b/>
+          <w:bCs/>
+        </w:rPr>
+        <w:t>)</w:t>
+      </w:r>
+      <w:r>
+        <w:rPr>
+          <w:rStyle w:val="Strong"/>
+        </w:rPr>
+        <w:t xml:space="preserve"> to get even numbers</w:t>
+      </w:r>
+    </w:p>
+    <w:p>
+      <w:pPr>
+        <w:pStyle w:val="NormalWeb"/>
+      </w:pPr>
+      <w:r>
+        <w:rPr>
+          <w:rStyle w:val="Strong"/>
+        </w:rPr>
+        <w:t xml:space="preserve">52. Use </w:t>
+      </w:r>
+      <w:proofErr w:type="gramStart"/>
+      <w:r>
+        <w:rPr>
+          <w:rStyle w:val="HTMLCode"/>
+          <w:b/>
+          <w:bCs/>
+        </w:rPr>
+        <w:t>reduce(</w:t>
+      </w:r>
+      <w:proofErr w:type="gramEnd"/>
+      <w:r>
+        <w:rPr>
+          <w:rStyle w:val="HTMLCode"/>
+          <w:b/>
+          <w:bCs/>
+        </w:rPr>
+        <w:t>)</w:t>
       </w:r>
       <w:r>
         <w:rPr>
@@ -1594,7 +2033,23 @@
         <w:pStyle w:val="NormalWeb"/>
       </w:pPr>
       <w:r>
-        <w:t xml:space="preserve">Ye normal DSA nahi hai; </w:t>
+        <w:t xml:space="preserve">Ye normal DSA </w:t>
+      </w:r>
+      <w:proofErr w:type="spellStart"/>
+      <w:r>
+        <w:t>nahi</w:t>
+      </w:r>
+      <w:proofErr w:type="spellEnd"/>
+      <w:r>
+        <w:t xml:space="preserve"> </w:t>
+      </w:r>
+      <w:proofErr w:type="spellStart"/>
+      <w:r>
+        <w:t>hai</w:t>
+      </w:r>
+      <w:proofErr w:type="spellEnd"/>
+      <w:r>
+        <w:t xml:space="preserve">; </w:t>
       </w:r>
       <w:r>
         <w:rPr>
@@ -1603,7 +2058,15 @@
         <w:t>Core Python interview ka actual topic</w:t>
       </w:r>
       <w:r>
-        <w:t xml:space="preserve"> hai.</w:t>
+        <w:t xml:space="preserve"> </w:t>
+      </w:r>
+      <w:proofErr w:type="spellStart"/>
+      <w:r>
+        <w:t>hai</w:t>
+      </w:r>
+      <w:proofErr w:type="spellEnd"/>
+      <w:r>
+        <w:t>.</w:t>
       </w:r>
     </w:p>
     <w:p>
@@ -1666,7 +2129,31 @@
         <w:pStyle w:val="NormalWeb"/>
       </w:pPr>
       <w:r>
-        <w:t>Interviewer yahan pooch sakta hai:</w:t>
+        <w:t xml:space="preserve">Interviewer </w:t>
+      </w:r>
+      <w:proofErr w:type="spellStart"/>
+      <w:r>
+        <w:t>yahan</w:t>
+      </w:r>
+      <w:proofErr w:type="spellEnd"/>
+      <w:r>
+        <w:t xml:space="preserve"> pooch </w:t>
+      </w:r>
+      <w:proofErr w:type="spellStart"/>
+      <w:r>
+        <w:t>sakta</w:t>
+      </w:r>
+      <w:proofErr w:type="spellEnd"/>
+      <w:r>
+        <w:t xml:space="preserve"> </w:t>
+      </w:r>
+      <w:proofErr w:type="spellStart"/>
+      <w:r>
+        <w:t>hai</w:t>
+      </w:r>
+      <w:proofErr w:type="spellEnd"/>
+      <w:r>
+        <w:t>:</w:t>
       </w:r>
     </w:p>
     <w:p>
@@ -1683,7 +2170,23 @@
         <w:t>yield</w:t>
       </w:r>
       <w:r>
-        <w:t xml:space="preserve"> kyun use kiya instead of </w:t>
+        <w:t xml:space="preserve"> </w:t>
+      </w:r>
+      <w:proofErr w:type="spellStart"/>
+      <w:r>
+        <w:t>kyun</w:t>
+      </w:r>
+      <w:proofErr w:type="spellEnd"/>
+      <w:r>
+        <w:t xml:space="preserve"> use </w:t>
+      </w:r>
+      <w:proofErr w:type="spellStart"/>
+      <w:r>
+        <w:t>kiya</w:t>
+      </w:r>
+      <w:proofErr w:type="spellEnd"/>
+      <w:r>
+        <w:t xml:space="preserve"> instead of </w:t>
       </w:r>
       <w:r>
         <w:rPr>
@@ -1713,7 +2216,23 @@
         <w:t>🔥</w:t>
       </w:r>
       <w:r>
-        <w:t xml:space="preserve"> Decorators — Django ke liye useful</w:t>
+        <w:t xml:space="preserve"> Decorators — Django </w:t>
+      </w:r>
+      <w:proofErr w:type="spellStart"/>
+      <w:r>
+        <w:t>ke</w:t>
+      </w:r>
+      <w:proofErr w:type="spellEnd"/>
+      <w:r>
+        <w:t xml:space="preserve"> </w:t>
+      </w:r>
+      <w:proofErr w:type="spellStart"/>
+      <w:r>
+        <w:t>liye</w:t>
+      </w:r>
+      <w:proofErr w:type="spellEnd"/>
+      <w:r>
+        <w:t xml:space="preserve"> useful</w:t>
       </w:r>
     </w:p>
     <w:p>
@@ -1749,11 +2268,19 @@
         </w:rPr>
         <w:t>@</w:t>
       </w:r>
+      <w:proofErr w:type="gramStart"/>
       <w:r>
         <w:rPr>
           <w:rStyle w:val="11"/>
         </w:rPr>
-        <w:t>my_decorator</w:t>
+        <w:t>my</w:t>
+      </w:r>
+      <w:proofErr w:type="gramEnd"/>
+      <w:r>
+        <w:rPr>
+          <w:rStyle w:val="11"/>
+        </w:rPr>
+        <w:t>_decorator</w:t>
       </w:r>
     </w:p>
     <w:p>
@@ -1775,6 +2302,7 @@
         </w:rPr>
         <w:t xml:space="preserve"> </w:t>
       </w:r>
+      <w:proofErr w:type="gramStart"/>
       <w:r>
         <w:rPr>
           <w:rStyle w:val="11"/>
@@ -1785,7 +2313,14 @@
         <w:rPr>
           <w:rStyle w:val="HTMLCode"/>
         </w:rPr>
-        <w:t>():</w:t>
+        <w:t>(</w:t>
+      </w:r>
+      <w:proofErr w:type="gramEnd"/>
+      <w:r>
+        <w:rPr>
+          <w:rStyle w:val="HTMLCode"/>
+        </w:rPr>
+        <w:t>):</w:t>
       </w:r>
     </w:p>
     <w:p>
@@ -1861,7 +2396,31 @@
         <w:pStyle w:val="NormalWeb"/>
       </w:pPr>
       <w:r>
-        <w:t>Ye questions particularly useful hain because Django me decorators ka actual use hota hai.</w:t>
+        <w:t xml:space="preserve">Ye questions particularly useful hain because Django me </w:t>
+      </w:r>
+      <w:proofErr w:type="gramStart"/>
+      <w:r>
+        <w:t>decorators</w:t>
+      </w:r>
+      <w:proofErr w:type="gramEnd"/>
+      <w:r>
+        <w:t xml:space="preserve"> ka actual use </w:t>
+      </w:r>
+      <w:proofErr w:type="spellStart"/>
+      <w:r>
+        <w:t>hota</w:t>
+      </w:r>
+      <w:proofErr w:type="spellEnd"/>
+      <w:r>
+        <w:t xml:space="preserve"> </w:t>
+      </w:r>
+      <w:proofErr w:type="spellStart"/>
+      <w:r>
+        <w:t>hai</w:t>
+      </w:r>
+      <w:proofErr w:type="spellEnd"/>
+      <w:r>
+        <w:t>.</w:t>
       </w:r>
     </w:p>
     <w:p>
@@ -1907,7 +2466,14 @@
         <w:rPr>
           <w:rStyle w:val="Strong"/>
         </w:rPr>
-        <w:t xml:space="preserve"> with name and marks</w:t>
+        <w:t xml:space="preserve"> with name and </w:t>
+      </w:r>
+      <w:proofErr w:type="gramStart"/>
+      <w:r>
+        <w:rPr>
+          <w:rStyle w:val="Strong"/>
+        </w:rPr>
+        <w:t>marks</w:t>
       </w:r>
       <w:r>
         <w:rPr>
@@ -1915,6 +2481,7 @@
         </w:rPr>
         <w:t xml:space="preserve"> .</w:t>
       </w:r>
+      <w:proofErr w:type="gramEnd"/>
     </w:p>
     <w:p>
       <w:pPr>
@@ -1932,146 +2499,43 @@
           <w:b/>
           <w:bCs/>
         </w:rPr>
-        <w:t>__init__()</w:t>
-      </w:r>
+        <w:t>__</w:t>
+      </w:r>
+      <w:proofErr w:type="spellStart"/>
       <w:r>
         <w:rPr>
           <w:rStyle w:val="HTMLCode"/>
           <w:b/>
           <w:bCs/>
         </w:rPr>
-        <w:t>.</w:t>
-      </w:r>
-    </w:p>
-    <w:p>
-      <w:pPr>
-        <w:pStyle w:val="NormalWeb"/>
-      </w:pPr>
-      <w:r>
-        <w:rPr>
-          <w:rStyle w:val="Strong"/>
-        </w:rPr>
-        <w:t>67. Create a class demonstrating encapsulation</w:t>
-      </w:r>
-      <w:r>
-        <w:rPr>
-          <w:rStyle w:val="Strong"/>
-        </w:rPr>
-        <w:t>.</w:t>
-      </w:r>
-    </w:p>
-    <w:p>
-      <w:pPr>
-        <w:pStyle w:val="NormalWeb"/>
-      </w:pPr>
-      <w:r>
-        <w:rPr>
-          <w:rStyle w:val="Strong"/>
-        </w:rPr>
-        <w:t>68. Create a parent and child class demonstrating inheritance</w:t>
-      </w:r>
-      <w:r>
-        <w:rPr>
-          <w:rStyle w:val="Strong"/>
-        </w:rPr>
-        <w:t>.</w:t>
-      </w:r>
-    </w:p>
-    <w:p>
-      <w:pPr>
-        <w:pStyle w:val="NormalWeb"/>
-      </w:pPr>
-      <w:r>
-        <w:rPr>
-          <w:rStyle w:val="Strong"/>
-        </w:rPr>
-        <w:t>69. Override a parent method in child class</w:t>
-      </w:r>
-      <w:r>
-        <w:rPr>
-          <w:rStyle w:val="Strong"/>
-        </w:rPr>
-        <w:t>.</w:t>
-      </w:r>
-    </w:p>
-    <w:p>
-      <w:pPr>
-        <w:pStyle w:val="NormalWeb"/>
-      </w:pPr>
-      <w:r>
-        <w:rPr>
-          <w:rStyle w:val="Strong"/>
-        </w:rPr>
-        <w:t xml:space="preserve">70. Use </w:t>
-      </w:r>
+        <w:t>init</w:t>
+      </w:r>
+      <w:proofErr w:type="spellEnd"/>
       <w:r>
         <w:rPr>
           <w:rStyle w:val="HTMLCode"/>
           <w:b/>
           <w:bCs/>
         </w:rPr>
-        <w:t>super()</w:t>
-      </w:r>
-      <w:r>
-        <w:rPr>
-          <w:rStyle w:val="Strong"/>
-        </w:rPr>
-        <w:t xml:space="preserve"> in inheritance</w:t>
-      </w:r>
-      <w:r>
-        <w:rPr>
-          <w:rStyle w:val="Strong"/>
-        </w:rPr>
-        <w:t>.</w:t>
-      </w:r>
-    </w:p>
-    <w:p>
-      <w:pPr>
-        <w:pStyle w:val="NormalWeb"/>
-      </w:pPr>
-      <w:r>
-        <w:rPr>
-          <w:rStyle w:val="Strong"/>
-        </w:rPr>
-        <w:t>71. Demonstrate polymorphism using two classes</w:t>
-      </w:r>
-    </w:p>
-    <w:p>
-      <w:pPr>
-        <w:pStyle w:val="NormalWeb"/>
-      </w:pPr>
-      <w:r>
-        <w:rPr>
-          <w:rStyle w:val="Strong"/>
-        </w:rPr>
-        <w:t xml:space="preserve">72. Create a class with </w:t>
-      </w:r>
+        <w:t>_</w:t>
+      </w:r>
+      <w:proofErr w:type="gramStart"/>
       <w:r>
         <w:rPr>
           <w:rStyle w:val="HTMLCode"/>
           <w:b/>
           <w:bCs/>
         </w:rPr>
-        <w:t>@classmethod</w:t>
-      </w:r>
+        <w:t>_(</w:t>
+      </w:r>
+      <w:proofErr w:type="gramEnd"/>
       <w:r>
         <w:rPr>
           <w:rStyle w:val="HTMLCode"/>
           <w:b/>
           <w:bCs/>
         </w:rPr>
-        <w:t>.</w:t>
-      </w:r>
-    </w:p>
-    <w:p>
-      <w:pPr>
-        <w:pStyle w:val="NormalWeb"/>
-      </w:pPr>
-      <w:r>
-        <w:rPr>
-          <w:rStyle w:val="Strong"/>
-        </w:rPr>
-        <w:t xml:space="preserve">73. Create a class with </w:t>
+        <w:t>)</w:t>
       </w:r>
       <w:r>
         <w:rPr>
@@ -2079,51 +2543,127 @@
           <w:b/>
           <w:bCs/>
         </w:rPr>
-        <w:t>@staticmethod</w:t>
-      </w:r>
+        <w:t>.</w:t>
+      </w:r>
+    </w:p>
+    <w:p>
+      <w:pPr>
+        <w:pStyle w:val="NormalWeb"/>
+      </w:pPr>
+      <w:r>
+        <w:rPr>
+          <w:rStyle w:val="Strong"/>
+        </w:rPr>
+        <w:t>67. Create a class demonstrating encapsulation</w:t>
+      </w:r>
+      <w:r>
+        <w:rPr>
+          <w:rStyle w:val="Strong"/>
+        </w:rPr>
+        <w:t>.</w:t>
+      </w:r>
+    </w:p>
+    <w:p>
+      <w:pPr>
+        <w:pStyle w:val="NormalWeb"/>
+      </w:pPr>
+      <w:r>
+        <w:rPr>
+          <w:rStyle w:val="Strong"/>
+        </w:rPr>
+        <w:t>68. Create a parent and child class demonstrating inheritance</w:t>
+      </w:r>
+      <w:r>
+        <w:rPr>
+          <w:rStyle w:val="Strong"/>
+        </w:rPr>
+        <w:t>.</w:t>
+      </w:r>
+    </w:p>
+    <w:p>
+      <w:pPr>
+        <w:pStyle w:val="NormalWeb"/>
+      </w:pPr>
+      <w:r>
+        <w:rPr>
+          <w:rStyle w:val="Strong"/>
+        </w:rPr>
+        <w:t>69. Override a parent method in child class</w:t>
+      </w:r>
+      <w:r>
+        <w:rPr>
+          <w:rStyle w:val="Strong"/>
+        </w:rPr>
+        <w:t>.</w:t>
+      </w:r>
+    </w:p>
+    <w:p>
+      <w:pPr>
+        <w:pStyle w:val="NormalWeb"/>
+      </w:pPr>
+      <w:r>
+        <w:rPr>
+          <w:rStyle w:val="Strong"/>
+        </w:rPr>
+        <w:t xml:space="preserve">70. Use </w:t>
+      </w:r>
+      <w:proofErr w:type="gramStart"/>
       <w:r>
         <w:rPr>
           <w:rStyle w:val="HTMLCode"/>
           <w:b/>
           <w:bCs/>
         </w:rPr>
-        <w:t>.</w:t>
-      </w:r>
-    </w:p>
-    <w:p>
-      <w:pPr>
-        <w:pStyle w:val="NormalWeb"/>
-      </w:pPr>
-      <w:r>
-        <w:rPr>
-          <w:rStyle w:val="Strong"/>
-        </w:rPr>
-        <w:t xml:space="preserve">74. Implement </w:t>
-      </w:r>
+        <w:t>super(</w:t>
+      </w:r>
+      <w:proofErr w:type="gramEnd"/>
       <w:r>
         <w:rPr>
           <w:rStyle w:val="HTMLCode"/>
           <w:b/>
           <w:bCs/>
         </w:rPr>
-        <w:t>__str__()</w:t>
-      </w:r>
-      <w:r>
-        <w:rPr>
-          <w:rStyle w:val="Strong"/>
-        </w:rPr>
-        <w:t xml:space="preserve"> in a class</w:t>
-      </w:r>
-    </w:p>
-    <w:p>
-      <w:pPr>
-        <w:pStyle w:val="NormalWeb"/>
-      </w:pPr>
-      <w:r>
-        <w:rPr>
-          <w:rStyle w:val="Strong"/>
-        </w:rPr>
-        <w:t xml:space="preserve">75. Implement </w:t>
+        <w:t>)</w:t>
+      </w:r>
+      <w:r>
+        <w:rPr>
+          <w:rStyle w:val="Strong"/>
+        </w:rPr>
+        <w:t xml:space="preserve"> in inheritance</w:t>
+      </w:r>
+      <w:r>
+        <w:rPr>
+          <w:rStyle w:val="Strong"/>
+        </w:rPr>
+        <w:t>.</w:t>
+      </w:r>
+    </w:p>
+    <w:p>
+      <w:pPr>
+        <w:pStyle w:val="NormalWeb"/>
+      </w:pPr>
+      <w:r>
+        <w:rPr>
+          <w:rStyle w:val="Strong"/>
+        </w:rPr>
+        <w:t>71. Demonstrate polymorphism using two classes</w:t>
+      </w:r>
+      <w:r>
+        <w:rPr>
+          <w:rStyle w:val="Strong"/>
+        </w:rPr>
+        <w:t>.</w:t>
+      </w:r>
+    </w:p>
+    <w:p>
+      <w:pPr>
+        <w:pStyle w:val="NormalWeb"/>
+      </w:pPr>
+      <w:r>
+        <w:rPr>
+          <w:rStyle w:val="Strong"/>
+        </w:rPr>
+        <w:t xml:space="preserve">72. Create a class with </w:t>
       </w:r>
       <w:r>
         <w:rPr>
@@ -2131,7 +2671,140 @@
           <w:b/>
           <w:bCs/>
         </w:rPr>
-        <w:t>__len__()</w:t>
+        <w:t>@classmethod</w:t>
+      </w:r>
+      <w:r>
+        <w:rPr>
+          <w:rStyle w:val="HTMLCode"/>
+          <w:b/>
+          <w:bCs/>
+        </w:rPr>
+        <w:t>.</w:t>
+      </w:r>
+    </w:p>
+    <w:p>
+      <w:pPr>
+        <w:pStyle w:val="NormalWeb"/>
+      </w:pPr>
+      <w:r>
+        <w:rPr>
+          <w:rStyle w:val="Strong"/>
+        </w:rPr>
+        <w:t xml:space="preserve">73. Create a class with </w:t>
+      </w:r>
+      <w:r>
+        <w:rPr>
+          <w:rStyle w:val="HTMLCode"/>
+          <w:b/>
+          <w:bCs/>
+        </w:rPr>
+        <w:t>@staticmethod</w:t>
+      </w:r>
+      <w:r>
+        <w:rPr>
+          <w:rStyle w:val="HTMLCode"/>
+          <w:b/>
+          <w:bCs/>
+        </w:rPr>
+        <w:t>.</w:t>
+      </w:r>
+    </w:p>
+    <w:p>
+      <w:pPr>
+        <w:pStyle w:val="NormalWeb"/>
+      </w:pPr>
+      <w:r>
+        <w:rPr>
+          <w:rStyle w:val="Strong"/>
+        </w:rPr>
+        <w:t xml:space="preserve">74. Implement </w:t>
+      </w:r>
+      <w:r>
+        <w:rPr>
+          <w:rStyle w:val="HTMLCode"/>
+          <w:b/>
+          <w:bCs/>
+        </w:rPr>
+        <w:t>__str_</w:t>
+      </w:r>
+      <w:proofErr w:type="gramStart"/>
+      <w:r>
+        <w:rPr>
+          <w:rStyle w:val="HTMLCode"/>
+          <w:b/>
+          <w:bCs/>
+        </w:rPr>
+        <w:t>_(</w:t>
+      </w:r>
+      <w:proofErr w:type="gramEnd"/>
+      <w:r>
+        <w:rPr>
+          <w:rStyle w:val="HTMLCode"/>
+          <w:b/>
+          <w:bCs/>
+        </w:rPr>
+        <w:t>)</w:t>
+      </w:r>
+      <w:r>
+        <w:rPr>
+          <w:rStyle w:val="Strong"/>
+        </w:rPr>
+        <w:t xml:space="preserve"> in a class</w:t>
+      </w:r>
+    </w:p>
+    <w:p>
+      <w:pPr>
+        <w:pStyle w:val="NormalWeb"/>
+      </w:pPr>
+      <w:r>
+        <w:rPr>
+          <w:rStyle w:val="Strong"/>
+        </w:rPr>
+        <w:t xml:space="preserve">75. Implement </w:t>
+      </w:r>
+      <w:r>
+        <w:rPr>
+          <w:rStyle w:val="HTMLCode"/>
+          <w:b/>
+          <w:bCs/>
+        </w:rPr>
+        <w:t>__</w:t>
+      </w:r>
+      <w:proofErr w:type="spellStart"/>
+      <w:r>
+        <w:rPr>
+          <w:rStyle w:val="HTMLCode"/>
+          <w:b/>
+          <w:bCs/>
+        </w:rPr>
+        <w:t>len</w:t>
+      </w:r>
+      <w:proofErr w:type="spellEnd"/>
+      <w:r>
+        <w:rPr>
+          <w:rStyle w:val="HTMLCode"/>
+          <w:b/>
+          <w:bCs/>
+        </w:rPr>
+        <w:t>_</w:t>
+      </w:r>
+      <w:proofErr w:type="gramStart"/>
+      <w:r>
+        <w:rPr>
+          <w:rStyle w:val="HTMLCode"/>
+          <w:b/>
+          <w:bCs/>
+        </w:rPr>
+        <w:t>_(</w:t>
+      </w:r>
+      <w:proofErr w:type="gramEnd"/>
+      <w:r>
+        <w:rPr>
+          <w:rStyle w:val="HTMLCode"/>
+          <w:b/>
+          <w:bCs/>
+        </w:rPr>
+        <w:t>)</w:t>
       </w:r>
       <w:r>
         <w:rPr>
@@ -2183,10 +2856,58 @@
         <w:rPr>
           <w:rStyle w:val="Strong"/>
         </w:rPr>
-        <w:t>ye category ignore mat karna</w:t>
-      </w:r>
-      <w:r>
-        <w:t>. Interviews me interviewer code dikha ke bol sakta hai:</w:t>
+        <w:t xml:space="preserve">ye category ignore mat </w:t>
+      </w:r>
+      <w:proofErr w:type="spellStart"/>
+      <w:r>
+        <w:rPr>
+          <w:rStyle w:val="Strong"/>
+        </w:rPr>
+        <w:t>karna</w:t>
+      </w:r>
+      <w:proofErr w:type="spellEnd"/>
+      <w:r>
+        <w:t xml:space="preserve">. Interviews me interviewer code </w:t>
+      </w:r>
+      <w:proofErr w:type="spellStart"/>
+      <w:r>
+        <w:t>dikha</w:t>
+      </w:r>
+      <w:proofErr w:type="spellEnd"/>
+      <w:r>
+        <w:t xml:space="preserve"> </w:t>
+      </w:r>
+      <w:proofErr w:type="spellStart"/>
+      <w:r>
+        <w:t>ke</w:t>
+      </w:r>
+      <w:proofErr w:type="spellEnd"/>
+      <w:r>
+        <w:t xml:space="preserve"> </w:t>
+      </w:r>
+      <w:proofErr w:type="spellStart"/>
+      <w:r>
+        <w:t>bol</w:t>
+      </w:r>
+      <w:proofErr w:type="spellEnd"/>
+      <w:r>
+        <w:t xml:space="preserve"> </w:t>
+      </w:r>
+      <w:proofErr w:type="spellStart"/>
+      <w:r>
+        <w:t>sakta</w:t>
+      </w:r>
+      <w:proofErr w:type="spellEnd"/>
+      <w:r>
+        <w:t xml:space="preserve"> </w:t>
+      </w:r>
+      <w:proofErr w:type="spellStart"/>
+      <w:r>
+        <w:t>hai</w:t>
+      </w:r>
+      <w:proofErr w:type="spellEnd"/>
+      <w:r>
+        <w:t>:</w:t>
       </w:r>
     </w:p>
     <w:p>
@@ -2228,18 +2949,28 @@
         </w:rPr>
         <w:t xml:space="preserve"> </w:t>
       </w:r>
+      <w:proofErr w:type="spellStart"/>
       <w:r>
         <w:rPr>
           <w:rStyle w:val="11"/>
         </w:rPr>
-        <w:t>add_item</w:t>
-      </w:r>
+        <w:t>add_</w:t>
+      </w:r>
+      <w:proofErr w:type="gramStart"/>
+      <w:r>
+        <w:rPr>
+          <w:rStyle w:val="11"/>
+        </w:rPr>
+        <w:t>item</w:t>
+      </w:r>
+      <w:proofErr w:type="spellEnd"/>
       <w:r>
         <w:rPr>
           <w:rStyle w:val="HTMLCode"/>
         </w:rPr>
         <w:t>(</w:t>
       </w:r>
+      <w:proofErr w:type="gramEnd"/>
       <w:r>
         <w:rPr>
           <w:rStyle w:val="11"/>
@@ -2284,6 +3015,8 @@
         </w:rPr>
         <w:t xml:space="preserve">    </w:t>
       </w:r>
+      <w:proofErr w:type="spellStart"/>
+      <w:proofErr w:type="gramStart"/>
       <w:r>
         <w:rPr>
           <w:rStyle w:val="11"/>
@@ -2300,7 +3033,15 @@
         <w:rPr>
           <w:rStyle w:val="HTMLCode"/>
         </w:rPr>
-        <w:t>append(</w:t>
+        <w:t>append</w:t>
+      </w:r>
+      <w:proofErr w:type="spellEnd"/>
+      <w:proofErr w:type="gramEnd"/>
+      <w:r>
+        <w:rPr>
+          <w:rStyle w:val="HTMLCode"/>
+        </w:rPr>
+        <w:t>(</w:t>
       </w:r>
       <w:r>
         <w:rPr>
@@ -2374,18 +3115,28 @@
         </w:rPr>
         <w:t>(</w:t>
       </w:r>
+      <w:proofErr w:type="spellStart"/>
       <w:r>
         <w:rPr>
           <w:rStyle w:val="11"/>
         </w:rPr>
-        <w:t>add_item</w:t>
-      </w:r>
+        <w:t>add_</w:t>
+      </w:r>
+      <w:proofErr w:type="gramStart"/>
+      <w:r>
+        <w:rPr>
+          <w:rStyle w:val="11"/>
+        </w:rPr>
+        <w:t>item</w:t>
+      </w:r>
+      <w:proofErr w:type="spellEnd"/>
       <w:r>
         <w:rPr>
           <w:rStyle w:val="HTMLCode"/>
         </w:rPr>
         <w:t>(</w:t>
       </w:r>
+      <w:proofErr w:type="gramEnd"/>
       <w:r>
         <w:rPr>
           <w:rStyle w:val="y"/>
@@ -2415,18 +3166,28 @@
         </w:rPr>
         <w:t>(</w:t>
       </w:r>
+      <w:proofErr w:type="spellStart"/>
       <w:r>
         <w:rPr>
           <w:rStyle w:val="11"/>
         </w:rPr>
-        <w:t>add_item</w:t>
-      </w:r>
+        <w:t>add_</w:t>
+      </w:r>
+      <w:proofErr w:type="gramStart"/>
+      <w:r>
+        <w:rPr>
+          <w:rStyle w:val="11"/>
+        </w:rPr>
+        <w:t>item</w:t>
+      </w:r>
+      <w:proofErr w:type="spellEnd"/>
       <w:r>
         <w:rPr>
           <w:rStyle w:val="HTMLCode"/>
         </w:rPr>
         <w:t>(</w:t>
       </w:r>
+      <w:proofErr w:type="gramEnd"/>
       <w:r>
         <w:rPr>
           <w:rStyle w:val="y"/>
@@ -2585,6 +3346,8 @@
           <w:rStyle w:val="HTMLCode"/>
         </w:rPr>
       </w:pPr>
+      <w:proofErr w:type="spellStart"/>
+      <w:proofErr w:type="gramStart"/>
       <w:r>
         <w:rPr>
           <w:rStyle w:val="11"/>
@@ -2601,7 +3364,15 @@
         <w:rPr>
           <w:rStyle w:val="HTMLCode"/>
         </w:rPr>
-        <w:t>append(</w:t>
+        <w:t>append</w:t>
+      </w:r>
+      <w:proofErr w:type="spellEnd"/>
+      <w:proofErr w:type="gramEnd"/>
+      <w:r>
+        <w:rPr>
+          <w:rStyle w:val="HTMLCode"/>
+        </w:rPr>
+        <w:t>(</w:t>
       </w:r>
       <w:r>
         <w:rPr>
@@ -2782,6 +3553,8 @@
         </w:rPr>
         <w:t xml:space="preserve"> </w:t>
       </w:r>
+      <w:proofErr w:type="spellStart"/>
+      <w:proofErr w:type="gramStart"/>
       <w:r>
         <w:rPr>
           <w:rStyle w:val="11"/>
@@ -2798,7 +3571,15 @@
         <w:rPr>
           <w:rStyle w:val="HTMLCode"/>
         </w:rPr>
-        <w:t>copy()</w:t>
+        <w:t>copy</w:t>
+      </w:r>
+      <w:proofErr w:type="spellEnd"/>
+      <w:proofErr w:type="gramEnd"/>
+      <w:r>
+        <w:rPr>
+          <w:rStyle w:val="HTMLCode"/>
+        </w:rPr>
+        <w:t>()</w:t>
       </w:r>
     </w:p>
     <w:p>
@@ -2834,6 +3615,7 @@
         </w:rPr>
         <w:t>0</w:t>
       </w:r>
+      <w:proofErr w:type="gramStart"/>
       <w:r>
         <w:rPr>
           <w:rStyle w:val="HTMLCode"/>
@@ -2850,7 +3632,14 @@
         <w:rPr>
           <w:rStyle w:val="HTMLCode"/>
         </w:rPr>
-        <w:t>append(</w:t>
+        <w:t>append</w:t>
+      </w:r>
+      <w:proofErr w:type="gramEnd"/>
+      <w:r>
+        <w:rPr>
+          <w:rStyle w:val="HTMLCode"/>
+        </w:rPr>
+        <w:t>(</w:t>
       </w:r>
       <w:r>
         <w:rPr>
@@ -3101,6 +3890,7 @@
           <w:rStyle w:val="HTMLCode"/>
         </w:rPr>
       </w:pPr>
+      <w:proofErr w:type="gramStart"/>
       <w:r>
         <w:rPr>
           <w:rStyle w:val="11"/>
@@ -3113,6 +3903,7 @@
         </w:rPr>
         <w:t>(</w:t>
       </w:r>
+      <w:proofErr w:type="gramEnd"/>
       <w:r>
         <w:rPr>
           <w:rStyle w:val="11"/>
@@ -3154,6 +3945,7 @@
       <w:pPr>
         <w:pStyle w:val="HTMLPreformatted"/>
       </w:pPr>
+      <w:proofErr w:type="gramStart"/>
       <w:r>
         <w:rPr>
           <w:rStyle w:val="11"/>
@@ -3166,6 +3958,7 @@
         </w:rPr>
         <w:t>(</w:t>
       </w:r>
+      <w:proofErr w:type="gramEnd"/>
       <w:r>
         <w:rPr>
           <w:rStyle w:val="11"/>
@@ -3480,6 +4273,7 @@
         <w:lastRenderedPageBreak/>
         <w:t xml:space="preserve">    </w:t>
       </w:r>
+      <w:proofErr w:type="spellStart"/>
       <w:r>
         <w:rPr>
           <w:rStyle w:val="11"/>
@@ -3492,12 +4286,21 @@
         </w:rPr>
         <w:t>.</w:t>
       </w:r>
-      <w:r>
-        <w:rPr>
-          <w:rStyle w:val="HTMLCode"/>
-        </w:rPr>
-        <w:t>append(</w:t>
-      </w:r>
+      <w:proofErr w:type="gramStart"/>
+      <w:r>
+        <w:rPr>
+          <w:rStyle w:val="HTMLCode"/>
+        </w:rPr>
+        <w:t>append</w:t>
+      </w:r>
+      <w:proofErr w:type="spellEnd"/>
+      <w:r>
+        <w:rPr>
+          <w:rStyle w:val="HTMLCode"/>
+        </w:rPr>
+        <w:t>(</w:t>
+      </w:r>
+      <w:proofErr w:type="gramEnd"/>
       <w:r>
         <w:rPr>
           <w:rStyle w:val="y"/>
@@ -3755,6 +4558,7 @@
         </w:rPr>
         <w:t>0</w:t>
       </w:r>
+      <w:proofErr w:type="gramStart"/>
       <w:r>
         <w:rPr>
           <w:rStyle w:val="HTMLCode"/>
@@ -3771,7 +4575,14 @@
         <w:rPr>
           <w:rStyle w:val="HTMLCode"/>
         </w:rPr>
-        <w:t>append(</w:t>
+        <w:t>append</w:t>
+      </w:r>
+      <w:proofErr w:type="gramEnd"/>
+      <w:r>
+        <w:rPr>
+          <w:rStyle w:val="HTMLCode"/>
+        </w:rPr>
+        <w:t>(</w:t>
       </w:r>
       <w:r>
         <w:rPr>
@@ -3846,8 +4657,18 @@
           <w:b/>
           <w:bCs/>
         </w:rPr>
-        <w:t>*args</w:t>
-      </w:r>
+        <w:t>*</w:t>
+      </w:r>
+      <w:proofErr w:type="spellStart"/>
+      <w:r>
+        <w:rPr>
+          <w:rStyle w:val="HTMLCode"/>
+          <w:b/>
+          <w:bCs/>
+        </w:rPr>
+        <w:t>args</w:t>
+      </w:r>
+      <w:proofErr w:type="spellEnd"/>
       <w:r>
         <w:rPr>
           <w:rStyle w:val="Strong"/>
@@ -3892,12 +4713,14 @@
         </w:rPr>
         <w:t>*</w:t>
       </w:r>
+      <w:proofErr w:type="spellStart"/>
       <w:r>
         <w:rPr>
           <w:rStyle w:val="11"/>
         </w:rPr>
         <w:t>args</w:t>
       </w:r>
+      <w:proofErr w:type="spellEnd"/>
       <w:r>
         <w:rPr>
           <w:rStyle w:val="HTMLCode"/>
@@ -3930,12 +4753,14 @@
         </w:rPr>
         <w:t>(</w:t>
       </w:r>
+      <w:proofErr w:type="spellStart"/>
       <w:r>
         <w:rPr>
           <w:rStyle w:val="11"/>
         </w:rPr>
         <w:t>args</w:t>
       </w:r>
+      <w:proofErr w:type="spellEnd"/>
       <w:r>
         <w:rPr>
           <w:rStyle w:val="HTMLCode"/>
@@ -3955,6 +4780,7 @@
       <w:pPr>
         <w:pStyle w:val="HTMLPreformatted"/>
       </w:pPr>
+      <w:proofErr w:type="gramStart"/>
       <w:r>
         <w:rPr>
           <w:rStyle w:val="11"/>
@@ -3967,6 +4793,7 @@
         </w:rPr>
         <w:t>(</w:t>
       </w:r>
+      <w:proofErr w:type="gramEnd"/>
       <w:r>
         <w:rPr>
           <w:rStyle w:val="y"/>
@@ -4027,8 +4854,18 @@
           <w:b/>
           <w:bCs/>
         </w:rPr>
-        <w:t>**kwargs</w:t>
-      </w:r>
+        <w:t>**</w:t>
+      </w:r>
+      <w:proofErr w:type="spellStart"/>
+      <w:r>
+        <w:rPr>
+          <w:rStyle w:val="HTMLCode"/>
+          <w:b/>
+          <w:bCs/>
+        </w:rPr>
+        <w:t>kwargs</w:t>
+      </w:r>
+      <w:proofErr w:type="spellEnd"/>
       <w:r>
         <w:rPr>
           <w:rStyle w:val="Strong"/>
@@ -4073,12 +4910,14 @@
         </w:rPr>
         <w:t>**</w:t>
       </w:r>
+      <w:proofErr w:type="spellStart"/>
       <w:r>
         <w:rPr>
           <w:rStyle w:val="11"/>
         </w:rPr>
         <w:t>kwargs</w:t>
       </w:r>
+      <w:proofErr w:type="spellEnd"/>
       <w:r>
         <w:rPr>
           <w:rStyle w:val="HTMLCode"/>
@@ -4111,12 +4950,14 @@
         </w:rPr>
         <w:t>(</w:t>
       </w:r>
+      <w:proofErr w:type="spellStart"/>
       <w:r>
         <w:rPr>
           <w:rStyle w:val="11"/>
         </w:rPr>
         <w:t>kwargs</w:t>
       </w:r>
+      <w:proofErr w:type="spellEnd"/>
       <w:r>
         <w:rPr>
           <w:rStyle w:val="HTMLCode"/>
@@ -4136,6 +4977,7 @@
       <w:pPr>
         <w:pStyle w:val="HTMLPreformatted"/>
       </w:pPr>
+      <w:proofErr w:type="gramStart"/>
       <w:r>
         <w:rPr>
           <w:rStyle w:val="11"/>
@@ -4148,6 +4990,7 @@
         </w:rPr>
         <w:t>(</w:t>
       </w:r>
+      <w:proofErr w:type="gramEnd"/>
       <w:r>
         <w:rPr>
           <w:rStyle w:val="11"/>
@@ -4369,18 +5212,22 @@
         </w:rPr>
         <w:t xml:space="preserve"> </w:t>
       </w:r>
+      <w:proofErr w:type="spellStart"/>
+      <w:proofErr w:type="gramStart"/>
       <w:r>
         <w:rPr>
           <w:rStyle w:val="10"/>
         </w:rPr>
         <w:t>AgeError</w:t>
       </w:r>
+      <w:proofErr w:type="spellEnd"/>
       <w:r>
         <w:rPr>
           <w:rStyle w:val="HTMLCode"/>
         </w:rPr>
         <w:t>(</w:t>
       </w:r>
+      <w:proofErr w:type="gramEnd"/>
       <w:r>
         <w:rPr>
           <w:rStyle w:val="11"/>
@@ -4446,7 +5293,23 @@
         <w:pStyle w:val="NormalWeb"/>
       </w:pPr>
       <w:r>
-        <w:t>Django/backend ke liye useful.</w:t>
+        <w:t xml:space="preserve">Django/backend </w:t>
+      </w:r>
+      <w:proofErr w:type="spellStart"/>
+      <w:r>
+        <w:t>ke</w:t>
+      </w:r>
+      <w:proofErr w:type="spellEnd"/>
+      <w:r>
+        <w:t xml:space="preserve"> </w:t>
+      </w:r>
+      <w:proofErr w:type="spellStart"/>
+      <w:r>
+        <w:t>liye</w:t>
+      </w:r>
+      <w:proofErr w:type="spellEnd"/>
+      <w:r>
+        <w:t xml:space="preserve"> useful.</w:t>
       </w:r>
     </w:p>
     <w:p>
@@ -4498,7 +5361,25 @@
           <w:b/>
           <w:bCs/>
         </w:rPr>
-        <w:t>with open()</w:t>
+        <w:t xml:space="preserve">with </w:t>
+      </w:r>
+      <w:proofErr w:type="gramStart"/>
+      <w:r>
+        <w:rPr>
+          <w:rStyle w:val="HTMLCode"/>
+          <w:b/>
+          <w:bCs/>
+        </w:rPr>
+        <w:t>open(</w:t>
+      </w:r>
+      <w:proofErr w:type="gramEnd"/>
+      <w:r>
+        <w:rPr>
+          <w:rStyle w:val="HTMLCode"/>
+          <w:b/>
+          <w:bCs/>
+        </w:rPr>
+        <w:t>)</w:t>
       </w:r>
     </w:p>
     <w:p>
@@ -4566,10 +5447,66 @@
         <w:rPr>
           <w:rStyle w:val="Strong"/>
         </w:rPr>
-        <w:t>Tier 2 DSA se pehle</w:t>
-      </w:r>
-      <w:r>
-        <w:t xml:space="preserve"> karna zyada useful hai tere backend goal ke liye.</w:t>
+        <w:t xml:space="preserve">Tier 2 DSA se </w:t>
+      </w:r>
+      <w:proofErr w:type="spellStart"/>
+      <w:r>
+        <w:rPr>
+          <w:rStyle w:val="Strong"/>
+        </w:rPr>
+        <w:t>pehle</w:t>
+      </w:r>
+      <w:proofErr w:type="spellEnd"/>
+      <w:r>
+        <w:t xml:space="preserve"> </w:t>
+      </w:r>
+      <w:proofErr w:type="spellStart"/>
+      <w:r>
+        <w:t>karna</w:t>
+      </w:r>
+      <w:proofErr w:type="spellEnd"/>
+      <w:r>
+        <w:t xml:space="preserve"> </w:t>
+      </w:r>
+      <w:proofErr w:type="spellStart"/>
+      <w:r>
+        <w:t>zyada</w:t>
+      </w:r>
+      <w:proofErr w:type="spellEnd"/>
+      <w:r>
+        <w:t xml:space="preserve"> useful </w:t>
+      </w:r>
+      <w:proofErr w:type="spellStart"/>
+      <w:r>
+        <w:t>hai</w:t>
+      </w:r>
+      <w:proofErr w:type="spellEnd"/>
+      <w:r>
+        <w:t xml:space="preserve"> </w:t>
+      </w:r>
+      <w:proofErr w:type="spellStart"/>
+      <w:r>
+        <w:t>tere</w:t>
+      </w:r>
+      <w:proofErr w:type="spellEnd"/>
+      <w:r>
+        <w:t xml:space="preserve"> backend goal </w:t>
+      </w:r>
+      <w:proofErr w:type="spellStart"/>
+      <w:r>
+        <w:t>ke</w:t>
+      </w:r>
+      <w:proofErr w:type="spellEnd"/>
+      <w:r>
+        <w:t xml:space="preserve"> </w:t>
+      </w:r>
+      <w:proofErr w:type="spellStart"/>
+      <w:r>
+        <w:t>liye</w:t>
+      </w:r>
+      <w:proofErr w:type="spellEnd"/>
+      <w:r>
+        <w:t>.</w:t>
       </w:r>
     </w:p>
     <w:p>
@@ -4588,139 +5525,49 @@
           <w:b/>
           <w:bCs/>
         </w:rPr>
-        <w:t>__iter__()</w:t>
-      </w:r>
-      <w:r>
-        <w:rPr>
-          <w:rStyle w:val="Strong"/>
-        </w:rPr>
-        <w:t xml:space="preserve"> and </w:t>
-      </w:r>
+        <w:t>__</w:t>
+      </w:r>
+      <w:proofErr w:type="spellStart"/>
       <w:r>
         <w:rPr>
           <w:rStyle w:val="HTMLCode"/>
           <w:b/>
           <w:bCs/>
         </w:rPr>
-        <w:t>__next__()</w:t>
-      </w:r>
-    </w:p>
-    <w:p>
-      <w:pPr>
-        <w:pStyle w:val="NormalWeb"/>
-      </w:pPr>
-      <w:r>
-        <w:rPr>
-          <w:rStyle w:val="Strong"/>
-        </w:rPr>
-        <w:t>100. Create a context manager</w:t>
-      </w:r>
-    </w:p>
-    <w:p>
-      <w:pPr>
-        <w:pStyle w:val="NormalWeb"/>
-      </w:pPr>
-      <w:r>
-        <w:rPr>
-          <w:rStyle w:val="Strong"/>
-        </w:rPr>
-        <w:t>101. Create a custom context manager using a class</w:t>
-      </w:r>
-    </w:p>
-    <w:p>
-      <w:pPr>
-        <w:pStyle w:val="NormalWeb"/>
-      </w:pPr>
-      <w:r>
-        <w:rPr>
-          <w:rStyle w:val="Strong"/>
-        </w:rPr>
-        <w:t xml:space="preserve">102. Create a context manager using </w:t>
-      </w:r>
+        <w:t>iter</w:t>
+      </w:r>
+      <w:proofErr w:type="spellEnd"/>
       <w:r>
         <w:rPr>
           <w:rStyle w:val="HTMLCode"/>
           <w:b/>
           <w:bCs/>
         </w:rPr>
-        <w:t>contextlib</w:t>
-      </w:r>
-    </w:p>
-    <w:p>
-      <w:pPr>
-        <w:pStyle w:val="NormalWeb"/>
-      </w:pPr>
-      <w:r>
-        <w:rPr>
-          <w:rStyle w:val="Strong"/>
-        </w:rPr>
-        <w:t xml:space="preserve">103. Implement a simple decorator using </w:t>
-      </w:r>
+        <w:t>_</w:t>
+      </w:r>
+      <w:proofErr w:type="gramStart"/>
       <w:r>
         <w:rPr>
           <w:rStyle w:val="HTMLCode"/>
           <w:b/>
           <w:bCs/>
         </w:rPr>
-        <w:t>functools.wraps</w:t>
-      </w:r>
-    </w:p>
-    <w:p>
-      <w:pPr>
-        <w:pStyle w:val="NormalWeb"/>
-      </w:pPr>
-      <w:r>
-        <w:rPr>
-          <w:rStyle w:val="Strong"/>
-        </w:rPr>
-        <w:t>104. Write a function demonstrating closure</w:t>
-      </w:r>
-    </w:p>
-    <w:p>
-      <w:pPr>
-        <w:pStyle w:val="NormalWeb"/>
-      </w:pPr>
-      <w:r>
-        <w:rPr>
-          <w:rStyle w:val="Strong"/>
-        </w:rPr>
-        <w:t>105. Create a closure that maintains a counter</w:t>
-      </w:r>
-    </w:p>
-    <w:p>
-      <w:pPr>
-        <w:pStyle w:val="NormalWeb"/>
-      </w:pPr>
-      <w:r>
-        <w:rPr>
-          <w:rStyle w:val="Strong"/>
-        </w:rPr>
-        <w:t xml:space="preserve">106. Use </w:t>
-      </w:r>
+        <w:t>_(</w:t>
+      </w:r>
+      <w:proofErr w:type="gramEnd"/>
       <w:r>
         <w:rPr>
           <w:rStyle w:val="HTMLCode"/>
           <w:b/>
           <w:bCs/>
         </w:rPr>
-        <w:t>enumerate()</w:t>
-      </w:r>
-      <w:r>
-        <w:rPr>
-          <w:rStyle w:val="Strong"/>
-        </w:rPr>
-        <w:t xml:space="preserve"> to print index + value</w:t>
-      </w:r>
-    </w:p>
-    <w:p>
-      <w:pPr>
-        <w:pStyle w:val="NormalWeb"/>
-      </w:pPr>
-      <w:r>
-        <w:rPr>
-          <w:rStyle w:val="Strong"/>
-        </w:rPr>
-        <w:t xml:space="preserve">107. Use </w:t>
+        <w:t>)</w:t>
+      </w:r>
+      <w:r>
+        <w:rPr>
+          <w:rStyle w:val="Strong"/>
+        </w:rPr>
+        <w:t xml:space="preserve"> and </w:t>
       </w:r>
       <w:r>
         <w:rPr>
@@ -4728,70 +5575,232 @@
           <w:b/>
           <w:bCs/>
         </w:rPr>
-        <w:t>zip()</w:t>
-      </w:r>
-      <w:r>
-        <w:rPr>
-          <w:rStyle w:val="Strong"/>
-        </w:rPr>
-        <w:t xml:space="preserve"> to combine two lists</w:t>
-      </w:r>
-    </w:p>
-    <w:p>
-      <w:pPr>
-        <w:pStyle w:val="NormalWeb"/>
-      </w:pPr>
-      <w:r>
-        <w:rPr>
-          <w:rStyle w:val="Strong"/>
-        </w:rPr>
-        <w:t xml:space="preserve">108. Use </w:t>
-      </w:r>
+        <w:t>__next__()</w:t>
+      </w:r>
+    </w:p>
+    <w:p>
+      <w:pPr>
+        <w:pStyle w:val="NormalWeb"/>
+      </w:pPr>
+      <w:r>
+        <w:rPr>
+          <w:rStyle w:val="Strong"/>
+        </w:rPr>
+        <w:t>100. Create a context manager</w:t>
+      </w:r>
+    </w:p>
+    <w:p>
+      <w:pPr>
+        <w:pStyle w:val="NormalWeb"/>
+      </w:pPr>
+      <w:r>
+        <w:rPr>
+          <w:rStyle w:val="Strong"/>
+        </w:rPr>
+        <w:t>101. Create a custom context manager using a class</w:t>
+      </w:r>
+    </w:p>
+    <w:p>
+      <w:pPr>
+        <w:pStyle w:val="NormalWeb"/>
+      </w:pPr>
+      <w:r>
+        <w:rPr>
+          <w:rStyle w:val="Strong"/>
+        </w:rPr>
+        <w:t xml:space="preserve">102. Create a context manager using </w:t>
+      </w:r>
+      <w:proofErr w:type="spellStart"/>
       <w:r>
         <w:rPr>
           <w:rStyle w:val="HTMLCode"/>
           <w:b/>
           <w:bCs/>
         </w:rPr>
-        <w:t>any()</w:t>
-      </w:r>
-      <w:r>
-        <w:rPr>
-          <w:rStyle w:val="Strong"/>
-        </w:rPr>
-        <w:t xml:space="preserve"> and </w:t>
-      </w:r>
+        <w:t>contextlib</w:t>
+      </w:r>
+      <w:proofErr w:type="spellEnd"/>
+    </w:p>
+    <w:p>
+      <w:pPr>
+        <w:pStyle w:val="NormalWeb"/>
+      </w:pPr>
+      <w:r>
+        <w:rPr>
+          <w:rStyle w:val="Strong"/>
+        </w:rPr>
+        <w:t xml:space="preserve">103. Implement a simple decorator using </w:t>
+      </w:r>
+      <w:proofErr w:type="spellStart"/>
+      <w:proofErr w:type="gramStart"/>
       <w:r>
         <w:rPr>
           <w:rStyle w:val="HTMLCode"/>
           <w:b/>
           <w:bCs/>
         </w:rPr>
-        <w:t>all()</w:t>
-      </w:r>
-      <w:r>
-        <w:rPr>
-          <w:rStyle w:val="Strong"/>
-        </w:rPr>
-        <w:t xml:space="preserve"> on a list</w:t>
-      </w:r>
-    </w:p>
-    <w:p>
-      <w:pPr>
-        <w:pStyle w:val="NormalWeb"/>
-      </w:pPr>
-      <w:r>
-        <w:rPr>
-          <w:rStyle w:val="Strong"/>
-        </w:rPr>
-        <w:t xml:space="preserve">109. Sort objects using </w:t>
-      </w:r>
+        <w:t>functools.wraps</w:t>
+      </w:r>
+      <w:proofErr w:type="spellEnd"/>
+      <w:proofErr w:type="gramEnd"/>
+    </w:p>
+    <w:p>
+      <w:pPr>
+        <w:pStyle w:val="NormalWeb"/>
+      </w:pPr>
+      <w:r>
+        <w:rPr>
+          <w:rStyle w:val="Strong"/>
+        </w:rPr>
+        <w:t>104. Write a function demonstrating closure</w:t>
+      </w:r>
+    </w:p>
+    <w:p>
+      <w:pPr>
+        <w:pStyle w:val="NormalWeb"/>
+      </w:pPr>
+      <w:r>
+        <w:rPr>
+          <w:rStyle w:val="Strong"/>
+        </w:rPr>
+        <w:t>105. Create a closure that maintains a counter</w:t>
+      </w:r>
+    </w:p>
+    <w:p>
+      <w:pPr>
+        <w:pStyle w:val="NormalWeb"/>
+      </w:pPr>
+      <w:r>
+        <w:rPr>
+          <w:rStyle w:val="Strong"/>
+        </w:rPr>
+        <w:t xml:space="preserve">106. Use </w:t>
+      </w:r>
+      <w:proofErr w:type="gramStart"/>
       <w:r>
         <w:rPr>
           <w:rStyle w:val="HTMLCode"/>
           <w:b/>
           <w:bCs/>
         </w:rPr>
+        <w:t>enumerate(</w:t>
+      </w:r>
+      <w:proofErr w:type="gramEnd"/>
+      <w:r>
+        <w:rPr>
+          <w:rStyle w:val="HTMLCode"/>
+          <w:b/>
+          <w:bCs/>
+        </w:rPr>
+        <w:t>)</w:t>
+      </w:r>
+      <w:r>
+        <w:rPr>
+          <w:rStyle w:val="Strong"/>
+        </w:rPr>
+        <w:t xml:space="preserve"> to print index + value</w:t>
+      </w:r>
+    </w:p>
+    <w:p>
+      <w:pPr>
+        <w:pStyle w:val="NormalWeb"/>
+      </w:pPr>
+      <w:r>
+        <w:rPr>
+          <w:rStyle w:val="Strong"/>
+        </w:rPr>
+        <w:t xml:space="preserve">107. Use </w:t>
+      </w:r>
+      <w:proofErr w:type="gramStart"/>
+      <w:r>
+        <w:rPr>
+          <w:rStyle w:val="HTMLCode"/>
+          <w:b/>
+          <w:bCs/>
+        </w:rPr>
+        <w:t>zip(</w:t>
+      </w:r>
+      <w:proofErr w:type="gramEnd"/>
+      <w:r>
+        <w:rPr>
+          <w:rStyle w:val="HTMLCode"/>
+          <w:b/>
+          <w:bCs/>
+        </w:rPr>
+        <w:t>)</w:t>
+      </w:r>
+      <w:r>
+        <w:rPr>
+          <w:rStyle w:val="Strong"/>
+        </w:rPr>
+        <w:t xml:space="preserve"> to combine two lists</w:t>
+      </w:r>
+    </w:p>
+    <w:p>
+      <w:pPr>
+        <w:pStyle w:val="NormalWeb"/>
+      </w:pPr>
+      <w:r>
+        <w:rPr>
+          <w:rStyle w:val="Strong"/>
+        </w:rPr>
+        <w:t xml:space="preserve">108. Use </w:t>
+      </w:r>
+      <w:proofErr w:type="gramStart"/>
+      <w:r>
+        <w:rPr>
+          <w:rStyle w:val="HTMLCode"/>
+          <w:b/>
+          <w:bCs/>
+        </w:rPr>
+        <w:t>any(</w:t>
+      </w:r>
+      <w:proofErr w:type="gramEnd"/>
+      <w:r>
+        <w:rPr>
+          <w:rStyle w:val="HTMLCode"/>
+          <w:b/>
+          <w:bCs/>
+        </w:rPr>
+        <w:t>)</w:t>
+      </w:r>
+      <w:r>
+        <w:rPr>
+          <w:rStyle w:val="Strong"/>
+        </w:rPr>
+        <w:t xml:space="preserve"> and </w:t>
+      </w:r>
+      <w:r>
+        <w:rPr>
+          <w:rStyle w:val="HTMLCode"/>
+          <w:b/>
+          <w:bCs/>
+        </w:rPr>
+        <w:t>all()</w:t>
+      </w:r>
+      <w:r>
+        <w:rPr>
+          <w:rStyle w:val="Strong"/>
+        </w:rPr>
+        <w:t xml:space="preserve"> on a list</w:t>
+      </w:r>
+    </w:p>
+    <w:p>
+      <w:pPr>
+        <w:pStyle w:val="NormalWeb"/>
+      </w:pPr>
+      <w:r>
+        <w:rPr>
+          <w:rStyle w:val="Strong"/>
+        </w:rPr>
+        <w:t xml:space="preserve">109. Sort objects using </w:t>
+      </w:r>
+      <w:r>
+        <w:rPr>
+          <w:rStyle w:val="HTMLCode"/>
+          <w:b/>
+          <w:bCs/>
+        </w:rPr>
         <w:t>key=</w:t>
       </w:r>
     </w:p>
@@ -4806,6 +5815,8 @@
         <w:lastRenderedPageBreak/>
         <w:t xml:space="preserve">110. Use </w:t>
       </w:r>
+      <w:proofErr w:type="spellStart"/>
+      <w:proofErr w:type="gramStart"/>
       <w:r>
         <w:rPr>
           <w:rStyle w:val="HTMLCode"/>
@@ -4814,6 +5825,8 @@
         </w:rPr>
         <w:t>collections.Counter</w:t>
       </w:r>
+      <w:proofErr w:type="spellEnd"/>
+      <w:proofErr w:type="gramEnd"/>
       <w:r>
         <w:rPr>
           <w:rStyle w:val="Strong"/>
@@ -4839,26 +5852,117 @@
         <w:t>🧠</w:t>
       </w:r>
       <w:r>
-        <w:t xml:space="preserve"> Lekin bhai ek important baat</w:t>
-      </w:r>
-    </w:p>
-    <w:p>
-      <w:pPr>
-        <w:pStyle w:val="NormalWeb"/>
-      </w:pPr>
-      <w:r>
-        <w:rPr>
-          <w:rStyle w:val="Strong"/>
-        </w:rPr>
-        <w:t>110 questions ka matlab ye nahi ki tujhe 110 alag-alag concepts padhne hain.</w:t>
-      </w:r>
-    </w:p>
-    <w:p>
-      <w:pPr>
-        <w:pStyle w:val="NormalWeb"/>
-      </w:pPr>
-      <w:r>
-        <w:t>Bahut saare questions same concept ko different angle se test karte hain.</w:t>
+        <w:t xml:space="preserve"> Lekin bhai ek important </w:t>
+      </w:r>
+      <w:proofErr w:type="spellStart"/>
+      <w:r>
+        <w:t>baat</w:t>
+      </w:r>
+      <w:proofErr w:type="spellEnd"/>
+    </w:p>
+    <w:p>
+      <w:pPr>
+        <w:pStyle w:val="NormalWeb"/>
+      </w:pPr>
+      <w:r>
+        <w:rPr>
+          <w:rStyle w:val="Strong"/>
+        </w:rPr>
+        <w:t xml:space="preserve">110 questions ka </w:t>
+      </w:r>
+      <w:proofErr w:type="spellStart"/>
+      <w:r>
+        <w:rPr>
+          <w:rStyle w:val="Strong"/>
+        </w:rPr>
+        <w:t>matlab</w:t>
+      </w:r>
+      <w:proofErr w:type="spellEnd"/>
+      <w:r>
+        <w:rPr>
+          <w:rStyle w:val="Strong"/>
+        </w:rPr>
+        <w:t xml:space="preserve"> ye </w:t>
+      </w:r>
+      <w:proofErr w:type="spellStart"/>
+      <w:r>
+        <w:rPr>
+          <w:rStyle w:val="Strong"/>
+        </w:rPr>
+        <w:t>nahi</w:t>
+      </w:r>
+      <w:proofErr w:type="spellEnd"/>
+      <w:r>
+        <w:rPr>
+          <w:rStyle w:val="Strong"/>
+        </w:rPr>
+        <w:t xml:space="preserve"> ki </w:t>
+      </w:r>
+      <w:proofErr w:type="spellStart"/>
+      <w:r>
+        <w:rPr>
+          <w:rStyle w:val="Strong"/>
+        </w:rPr>
+        <w:t>tujhe</w:t>
+      </w:r>
+      <w:proofErr w:type="spellEnd"/>
+      <w:r>
+        <w:rPr>
+          <w:rStyle w:val="Strong"/>
+        </w:rPr>
+        <w:t xml:space="preserve"> 110 </w:t>
+      </w:r>
+      <w:proofErr w:type="spellStart"/>
+      <w:r>
+        <w:rPr>
+          <w:rStyle w:val="Strong"/>
+        </w:rPr>
+        <w:t>alag-alag</w:t>
+      </w:r>
+      <w:proofErr w:type="spellEnd"/>
+      <w:r>
+        <w:rPr>
+          <w:rStyle w:val="Strong"/>
+        </w:rPr>
+        <w:t xml:space="preserve"> concepts </w:t>
+      </w:r>
+      <w:proofErr w:type="spellStart"/>
+      <w:r>
+        <w:rPr>
+          <w:rStyle w:val="Strong"/>
+        </w:rPr>
+        <w:t>padhne</w:t>
+      </w:r>
+      <w:proofErr w:type="spellEnd"/>
+      <w:r>
+        <w:rPr>
+          <w:rStyle w:val="Strong"/>
+        </w:rPr>
+        <w:t xml:space="preserve"> hain.</w:t>
+      </w:r>
+    </w:p>
+    <w:p>
+      <w:pPr>
+        <w:pStyle w:val="NormalWeb"/>
+      </w:pPr>
+      <w:r>
+        <w:t xml:space="preserve">Bahut </w:t>
+      </w:r>
+      <w:proofErr w:type="spellStart"/>
+      <w:r>
+        <w:t>saare</w:t>
+      </w:r>
+      <w:proofErr w:type="spellEnd"/>
+      <w:r>
+        <w:t xml:space="preserve"> questions same concept ko different angle se test </w:t>
+      </w:r>
+      <w:proofErr w:type="spellStart"/>
+      <w:r>
+        <w:t>karte</w:t>
+      </w:r>
+      <w:proofErr w:type="spellEnd"/>
+      <w:r>
+        <w:t xml:space="preserve"> hain.</w:t>
       </w:r>
     </w:p>
     <w:p>
@@ -4974,8 +6078,18 @@
         <w:rPr>
           <w:rStyle w:val="HTMLCode"/>
         </w:rPr>
-        <w:t>*args</w:t>
-      </w:r>
+        <w:t>*</w:t>
+      </w:r>
+      <w:proofErr w:type="spellStart"/>
+      <w:proofErr w:type="gramStart"/>
+      <w:r>
+        <w:rPr>
+          <w:rStyle w:val="HTMLCode"/>
+        </w:rPr>
+        <w:t>args</w:t>
+      </w:r>
+      <w:proofErr w:type="spellEnd"/>
+      <w:proofErr w:type="gramEnd"/>
     </w:p>
     <w:p>
       <w:pPr>
@@ -4988,8 +6102,16 @@
         <w:rPr>
           <w:rStyle w:val="HTMLCode"/>
         </w:rPr>
-        <w:t>**kwargs</w:t>
-      </w:r>
+        <w:t>**</w:t>
+      </w:r>
+      <w:proofErr w:type="spellStart"/>
+      <w:r>
+        <w:rPr>
+          <w:rStyle w:val="HTMLCode"/>
+        </w:rPr>
+        <w:t>kwargs</w:t>
+      </w:r>
+      <w:proofErr w:type="spellEnd"/>
     </w:p>
     <w:p>
       <w:pPr>
@@ -5021,7 +6143,15 @@
         <w:pStyle w:val="NormalWeb"/>
       </w:pPr>
       <w:r>
-        <w:t>ek hi family hai.</w:t>
+        <w:t xml:space="preserve">ek hi family </w:t>
+      </w:r>
+      <w:proofErr w:type="spellStart"/>
+      <w:r>
+        <w:t>hai</w:t>
+      </w:r>
+      <w:proofErr w:type="spellEnd"/>
+      <w:r>
+        <w:t>.</w:t>
       </w:r>
     </w:p>
     <w:p>
@@ -5042,15 +6172,55 @@
         <w:t>🎯</w:t>
       </w:r>
       <w:r>
-        <w:t xml:space="preserve"> Tere 6 LPA target ke liye priority</w:t>
-      </w:r>
-    </w:p>
-    <w:p>
-      <w:pPr>
-        <w:pStyle w:val="NormalWeb"/>
-      </w:pPr>
-      <w:r>
-        <w:t>Agar mujhe ye 110 ko priority deni ho:</w:t>
+        <w:t xml:space="preserve"> Tere 6 LPA target </w:t>
+      </w:r>
+      <w:proofErr w:type="spellStart"/>
+      <w:r>
+        <w:t>ke</w:t>
+      </w:r>
+      <w:proofErr w:type="spellEnd"/>
+      <w:r>
+        <w:t xml:space="preserve"> </w:t>
+      </w:r>
+      <w:proofErr w:type="spellStart"/>
+      <w:r>
+        <w:t>liye</w:t>
+      </w:r>
+      <w:proofErr w:type="spellEnd"/>
+      <w:r>
+        <w:t xml:space="preserve"> priority</w:t>
+      </w:r>
+    </w:p>
+    <w:p>
+      <w:pPr>
+        <w:pStyle w:val="NormalWeb"/>
+      </w:pPr>
+      <w:r>
+        <w:t xml:space="preserve">Agar </w:t>
+      </w:r>
+      <w:proofErr w:type="spellStart"/>
+      <w:r>
+        <w:t>mujhe</w:t>
+      </w:r>
+      <w:proofErr w:type="spellEnd"/>
+      <w:r>
+        <w:t xml:space="preserve"> ye 110 ko priority </w:t>
+      </w:r>
+      <w:proofErr w:type="spellStart"/>
+      <w:r>
+        <w:t>deni</w:t>
+      </w:r>
+      <w:proofErr w:type="spellEnd"/>
+      <w:r>
+        <w:t xml:space="preserve"> </w:t>
+      </w:r>
+      <w:proofErr w:type="spellStart"/>
+      <w:r>
+        <w:t>ho</w:t>
+      </w:r>
+      <w:proofErr w:type="spellEnd"/>
+      <w:r>
+        <w:t>:</w:t>
       </w:r>
     </w:p>
     <w:p>
@@ -5079,7 +6249,15 @@
       </w:r>
       <w:r>
         <w:br/>
-        <w:t>Basic Python + List + Dict + String</w:t>
+        <w:t xml:space="preserve">Basic Python + List + </w:t>
+      </w:r>
+      <w:proofErr w:type="spellStart"/>
+      <w:r>
+        <w:t>Dict</w:t>
+      </w:r>
+      <w:proofErr w:type="spellEnd"/>
+      <w:r>
+        <w:t xml:space="preserve"> + String</w:t>
       </w:r>
     </w:p>
     <w:p>
@@ -5220,12 +6398,14 @@
       <w:r>
         <w:t xml:space="preserve">Iterator, context manager, closures, </w:t>
       </w:r>
+      <w:proofErr w:type="spellStart"/>
       <w:r>
         <w:rPr>
           <w:rStyle w:val="HTMLCode"/>
         </w:rPr>
         <w:t>functools</w:t>
       </w:r>
+      <w:proofErr w:type="spellEnd"/>
       <w:r>
         <w:t xml:space="preserve">, </w:t>
       </w:r>
@@ -5251,7 +6431,31 @@
         <w:pStyle w:val="Heading2"/>
       </w:pPr>
       <w:r>
-        <w:t xml:space="preserve">Aur tere liye sabse important strategy </w:t>
+        <w:t xml:space="preserve">Aur </w:t>
+      </w:r>
+      <w:proofErr w:type="spellStart"/>
+      <w:r>
+        <w:t>tere</w:t>
+      </w:r>
+      <w:proofErr w:type="spellEnd"/>
+      <w:r>
+        <w:t xml:space="preserve"> </w:t>
+      </w:r>
+      <w:proofErr w:type="spellStart"/>
+      <w:r>
+        <w:t>liye</w:t>
+      </w:r>
+      <w:proofErr w:type="spellEnd"/>
+      <w:r>
+        <w:t xml:space="preserve"> </w:t>
+      </w:r>
+      <w:proofErr w:type="spellStart"/>
+      <w:r>
+        <w:t>sabse</w:t>
+      </w:r>
+      <w:proofErr w:type="spellEnd"/>
+      <w:r>
+        <w:t xml:space="preserve"> important strategy </w:t>
       </w:r>
       <w:r>
         <w:rPr>
@@ -5271,8 +6475,44 @@
         <w:rPr>
           <w:rStyle w:val="Strong"/>
         </w:rPr>
-        <w:t>110 questions ek saath nahi karenge</w:t>
-      </w:r>
+        <w:t xml:space="preserve">110 questions ek </w:t>
+      </w:r>
+      <w:proofErr w:type="spellStart"/>
+      <w:r>
+        <w:rPr>
+          <w:rStyle w:val="Strong"/>
+        </w:rPr>
+        <w:t>saath</w:t>
+      </w:r>
+      <w:proofErr w:type="spellEnd"/>
+      <w:r>
+        <w:rPr>
+          <w:rStyle w:val="Strong"/>
+        </w:rPr>
+        <w:t xml:space="preserve"> </w:t>
+      </w:r>
+      <w:proofErr w:type="spellStart"/>
+      <w:r>
+        <w:rPr>
+          <w:rStyle w:val="Strong"/>
+        </w:rPr>
+        <w:t>nahi</w:t>
+      </w:r>
+      <w:proofErr w:type="spellEnd"/>
+      <w:r>
+        <w:rPr>
+          <w:rStyle w:val="Strong"/>
+        </w:rPr>
+        <w:t xml:space="preserve"> </w:t>
+      </w:r>
+      <w:proofErr w:type="spellStart"/>
+      <w:r>
+        <w:rPr>
+          <w:rStyle w:val="Strong"/>
+        </w:rPr>
+        <w:t>karenge</w:t>
+      </w:r>
+      <w:proofErr w:type="spellEnd"/>
       <w:r>
         <w:t>.</w:t>
       </w:r>
@@ -5282,7 +6522,31 @@
         <w:pStyle w:val="NormalWeb"/>
       </w:pPr>
       <w:r>
-        <w:t>Hum bilkul DSA ki tarah karenge:</w:t>
+        <w:t xml:space="preserve">Hum </w:t>
+      </w:r>
+      <w:proofErr w:type="spellStart"/>
+      <w:r>
+        <w:t>bilkul</w:t>
+      </w:r>
+      <w:proofErr w:type="spellEnd"/>
+      <w:r>
+        <w:t xml:space="preserve"> DSA ki </w:t>
+      </w:r>
+      <w:proofErr w:type="spellStart"/>
+      <w:r>
+        <w:t>tarah</w:t>
+      </w:r>
+      <w:proofErr w:type="spellEnd"/>
+      <w:r>
+        <w:t xml:space="preserve"> </w:t>
+      </w:r>
+      <w:proofErr w:type="spellStart"/>
+      <w:r>
+        <w:t>karenge</w:t>
+      </w:r>
+      <w:proofErr w:type="spellEnd"/>
+      <w:r>
+        <w:t>:</w:t>
       </w:r>
     </w:p>
     <w:p>
@@ -5324,8 +6588,30 @@
         <w:rPr>
           <w:rStyle w:val="HTMLCode"/>
         </w:rPr>
-        <w:t>Pehle tu attempt karega</w:t>
-      </w:r>
+        <w:t xml:space="preserve">Pehle </w:t>
+      </w:r>
+      <w:proofErr w:type="spellStart"/>
+      <w:r>
+        <w:rPr>
+          <w:rStyle w:val="HTMLCode"/>
+        </w:rPr>
+        <w:t>tu</w:t>
+      </w:r>
+      <w:proofErr w:type="spellEnd"/>
+      <w:r>
+        <w:rPr>
+          <w:rStyle w:val="HTMLCode"/>
+        </w:rPr>
+        <w:t xml:space="preserve"> attempt </w:t>
+      </w:r>
+      <w:proofErr w:type="spellStart"/>
+      <w:r>
+        <w:rPr>
+          <w:rStyle w:val="HTMLCode"/>
+        </w:rPr>
+        <w:t>karega</w:t>
+      </w:r>
+      <w:proofErr w:type="spellEnd"/>
     </w:p>
     <w:p>
       <w:pPr>
@@ -5380,8 +6666,16 @@
         <w:rPr>
           <w:rStyle w:val="HTMLCode"/>
         </w:rPr>
-        <w:t>Tu code karega</w:t>
-      </w:r>
+        <w:t xml:space="preserve">Tu code </w:t>
+      </w:r>
+      <w:proofErr w:type="spellStart"/>
+      <w:r>
+        <w:rPr>
+          <w:rStyle w:val="HTMLCode"/>
+        </w:rPr>
+        <w:t>karega</w:t>
+      </w:r>
+      <w:proofErr w:type="spellEnd"/>
     </w:p>
     <w:p>
       <w:pPr>
@@ -5475,8 +6769,44 @@
         <w:rPr>
           <w:rStyle w:val="Strong"/>
         </w:rPr>
-        <w:t>random LeetCode-type Python questions nahi ghusaunga</w:t>
-      </w:r>
+        <w:t xml:space="preserve">random </w:t>
+      </w:r>
+      <w:proofErr w:type="spellStart"/>
+      <w:r>
+        <w:rPr>
+          <w:rStyle w:val="Strong"/>
+        </w:rPr>
+        <w:t>LeetCode</w:t>
+      </w:r>
+      <w:proofErr w:type="spellEnd"/>
+      <w:r>
+        <w:rPr>
+          <w:rStyle w:val="Strong"/>
+        </w:rPr>
+        <w:t xml:space="preserve">-type Python questions </w:t>
+      </w:r>
+      <w:proofErr w:type="spellStart"/>
+      <w:r>
+        <w:rPr>
+          <w:rStyle w:val="Strong"/>
+        </w:rPr>
+        <w:t>nahi</w:t>
+      </w:r>
+      <w:proofErr w:type="spellEnd"/>
+      <w:r>
+        <w:rPr>
+          <w:rStyle w:val="Strong"/>
+        </w:rPr>
+        <w:t xml:space="preserve"> </w:t>
+      </w:r>
+      <w:proofErr w:type="spellStart"/>
+      <w:r>
+        <w:rPr>
+          <w:rStyle w:val="Strong"/>
+        </w:rPr>
+        <w:t>ghusaunga</w:t>
+      </w:r>
+      <w:proofErr w:type="spellEnd"/>
       <w:r>
         <w:t xml:space="preserve">. Core Python ko specifically </w:t>
       </w:r>
@@ -5487,15 +6817,55 @@
         <w:t>Python + Django fresher interview</w:t>
       </w:r>
       <w:r>
-        <w:t xml:space="preserve"> ke perspective se rakhenge.</w:t>
-      </w:r>
-    </w:p>
-    <w:p>
-      <w:pPr>
-        <w:pStyle w:val="NormalWeb"/>
-      </w:pPr>
-      <w:r>
-        <w:t xml:space="preserve">Tera DSA Tier 1 already separate track hai; iske saath </w:t>
+        <w:t xml:space="preserve"> </w:t>
+      </w:r>
+      <w:proofErr w:type="spellStart"/>
+      <w:r>
+        <w:t>ke</w:t>
+      </w:r>
+      <w:proofErr w:type="spellEnd"/>
+      <w:r>
+        <w:t xml:space="preserve"> perspective se </w:t>
+      </w:r>
+      <w:proofErr w:type="spellStart"/>
+      <w:r>
+        <w:t>rakhenge</w:t>
+      </w:r>
+      <w:proofErr w:type="spellEnd"/>
+      <w:r>
+        <w:t>.</w:t>
+      </w:r>
+    </w:p>
+    <w:p>
+      <w:pPr>
+        <w:pStyle w:val="NormalWeb"/>
+      </w:pPr>
+      <w:r>
+        <w:t xml:space="preserve">Tera DSA Tier 1 already separate track </w:t>
+      </w:r>
+      <w:proofErr w:type="spellStart"/>
+      <w:r>
+        <w:t>hai</w:t>
+      </w:r>
+      <w:proofErr w:type="spellEnd"/>
+      <w:r>
+        <w:t xml:space="preserve">; </w:t>
+      </w:r>
+      <w:proofErr w:type="spellStart"/>
+      <w:r>
+        <w:t>iske</w:t>
+      </w:r>
+      <w:proofErr w:type="spellEnd"/>
+      <w:r>
+        <w:t xml:space="preserve"> </w:t>
+      </w:r>
+      <w:proofErr w:type="spellStart"/>
+      <w:r>
+        <w:t>saath</w:t>
+      </w:r>
+      <w:proofErr w:type="spellEnd"/>
+      <w:r>
+        <w:t xml:space="preserve"> </w:t>
       </w:r>
       <w:r>
         <w:rPr>
@@ -5504,7 +6874,47 @@
         <w:t>Core Python + OOP + Django + DRF + SQL</w:t>
       </w:r>
       <w:r>
-        <w:t xml:space="preserve"> ko priority dena tere target ke liye much better rahega.</w:t>
+        <w:t xml:space="preserve"> ko priority </w:t>
+      </w:r>
+      <w:proofErr w:type="spellStart"/>
+      <w:r>
+        <w:t>dena</w:t>
+      </w:r>
+      <w:proofErr w:type="spellEnd"/>
+      <w:r>
+        <w:t xml:space="preserve"> </w:t>
+      </w:r>
+      <w:proofErr w:type="spellStart"/>
+      <w:r>
+        <w:t>tere</w:t>
+      </w:r>
+      <w:proofErr w:type="spellEnd"/>
+      <w:r>
+        <w:t xml:space="preserve"> target </w:t>
+      </w:r>
+      <w:proofErr w:type="spellStart"/>
+      <w:r>
+        <w:t>ke</w:t>
+      </w:r>
+      <w:proofErr w:type="spellEnd"/>
+      <w:r>
+        <w:t xml:space="preserve"> </w:t>
+      </w:r>
+      <w:proofErr w:type="spellStart"/>
+      <w:r>
+        <w:t>liye</w:t>
+      </w:r>
+      <w:proofErr w:type="spellEnd"/>
+      <w:r>
+        <w:t xml:space="preserve"> much better </w:t>
+      </w:r>
+      <w:proofErr w:type="spellStart"/>
+      <w:r>
+        <w:t>rahega</w:t>
+      </w:r>
+      <w:proofErr w:type="spellEnd"/>
+      <w:r>
+        <w:t>.</w:t>
       </w:r>
     </w:p>
     <w:p>
@@ -5523,46 +6933,265 @@
       <w:r>
         <w:t xml:space="preserve"> </w:t>
       </w:r>
-      <w:r>
-        <w:rPr>
-          <w:rStyle w:val="Strong"/>
-        </w:rPr>
-        <w:t>itne Core Python questions enough hain tumhare 6 LPA target ke liye.</w:t>
-      </w:r>
-      <w:r>
-        <w:t xml:space="preserve"> Agar time kam hai, main tumhe extra random questions karne ko </w:t>
-      </w:r>
+      <w:proofErr w:type="spellStart"/>
+      <w:r>
+        <w:rPr>
+          <w:rStyle w:val="Strong"/>
+        </w:rPr>
+        <w:t>itne</w:t>
+      </w:r>
+      <w:proofErr w:type="spellEnd"/>
+      <w:r>
+        <w:rPr>
+          <w:rStyle w:val="Strong"/>
+        </w:rPr>
+        <w:t xml:space="preserve"> Core Python questions enough hain </w:t>
+      </w:r>
+      <w:proofErr w:type="spellStart"/>
+      <w:r>
+        <w:rPr>
+          <w:rStyle w:val="Strong"/>
+        </w:rPr>
+        <w:t>tumhare</w:t>
+      </w:r>
+      <w:proofErr w:type="spellEnd"/>
+      <w:r>
+        <w:rPr>
+          <w:rStyle w:val="Strong"/>
+        </w:rPr>
+        <w:t xml:space="preserve"> 6 LPA target </w:t>
+      </w:r>
+      <w:proofErr w:type="spellStart"/>
+      <w:r>
+        <w:rPr>
+          <w:rStyle w:val="Strong"/>
+        </w:rPr>
+        <w:t>ke</w:t>
+      </w:r>
+      <w:proofErr w:type="spellEnd"/>
+      <w:r>
+        <w:rPr>
+          <w:rStyle w:val="Strong"/>
+        </w:rPr>
+        <w:t xml:space="preserve"> </w:t>
+      </w:r>
+      <w:proofErr w:type="spellStart"/>
+      <w:r>
+        <w:rPr>
+          <w:rStyle w:val="Strong"/>
+        </w:rPr>
+        <w:t>liye</w:t>
+      </w:r>
+      <w:proofErr w:type="spellEnd"/>
+      <w:r>
+        <w:rPr>
+          <w:rStyle w:val="Strong"/>
+        </w:rPr>
+        <w:t>.</w:t>
+      </w:r>
+      <w:r>
+        <w:t xml:space="preserve"> Agar time </w:t>
+      </w:r>
+      <w:proofErr w:type="spellStart"/>
+      <w:r>
+        <w:t>kam</w:t>
+      </w:r>
+      <w:proofErr w:type="spellEnd"/>
+      <w:r>
+        <w:t xml:space="preserve"> </w:t>
+      </w:r>
+      <w:proofErr w:type="spellStart"/>
+      <w:r>
+        <w:t>hai</w:t>
+      </w:r>
+      <w:proofErr w:type="spellEnd"/>
+      <w:r>
+        <w:t xml:space="preserve">, main </w:t>
+      </w:r>
+      <w:proofErr w:type="spellStart"/>
+      <w:r>
+        <w:t>tumhe</w:t>
+      </w:r>
+      <w:proofErr w:type="spellEnd"/>
+      <w:r>
+        <w:t xml:space="preserve"> extra random questions </w:t>
+      </w:r>
+      <w:proofErr w:type="spellStart"/>
+      <w:r>
+        <w:t>karne</w:t>
+      </w:r>
+      <w:proofErr w:type="spellEnd"/>
+      <w:r>
+        <w:t xml:space="preserve"> ko </w:t>
+      </w:r>
+      <w:proofErr w:type="spellStart"/>
       <w:r>
         <w:rPr>
           <w:rStyle w:val="Strong"/>
         </w:rPr>
         <w:t>nahi</w:t>
       </w:r>
-      <w:r>
-        <w:t xml:space="preserve"> bolunga.</w:t>
-      </w:r>
-    </w:p>
-    <w:p>
-      <w:pPr>
-        <w:pStyle w:val="NormalWeb"/>
-      </w:pPr>
-      <w:r>
-        <w:t xml:space="preserve">Bas ek condition hai: </w:t>
-      </w:r>
-      <w:r>
-        <w:rPr>
-          <w:rStyle w:val="Strong"/>
-        </w:rPr>
-        <w:t>list complete karna enough nahi hai — unke concepts aur code confidently kar paana chahiye.</w:t>
-      </w:r>
-    </w:p>
-    <w:p>
-      <w:pPr>
-        <w:pStyle w:val="NormalWeb"/>
-      </w:pPr>
+      <w:proofErr w:type="spellEnd"/>
+      <w:r>
+        <w:t xml:space="preserve"> </w:t>
+      </w:r>
+      <w:proofErr w:type="spellStart"/>
+      <w:r>
+        <w:t>bolunga</w:t>
+      </w:r>
+      <w:proofErr w:type="spellEnd"/>
+      <w:r>
+        <w:t>.</w:t>
+      </w:r>
+    </w:p>
+    <w:p>
+      <w:pPr>
+        <w:pStyle w:val="NormalWeb"/>
+      </w:pPr>
+      <w:r>
+        <w:t xml:space="preserve">Bas ek condition </w:t>
+      </w:r>
+      <w:proofErr w:type="spellStart"/>
+      <w:r>
+        <w:t>hai</w:t>
+      </w:r>
+      <w:proofErr w:type="spellEnd"/>
+      <w:r>
+        <w:t xml:space="preserve">: </w:t>
+      </w:r>
+      <w:r>
+        <w:rPr>
+          <w:rStyle w:val="Strong"/>
+        </w:rPr>
+        <w:t xml:space="preserve">list complete </w:t>
+      </w:r>
+      <w:proofErr w:type="spellStart"/>
+      <w:r>
+        <w:rPr>
+          <w:rStyle w:val="Strong"/>
+        </w:rPr>
+        <w:t>karna</w:t>
+      </w:r>
+      <w:proofErr w:type="spellEnd"/>
+      <w:r>
+        <w:rPr>
+          <w:rStyle w:val="Strong"/>
+        </w:rPr>
+        <w:t xml:space="preserve"> enough </w:t>
+      </w:r>
+      <w:proofErr w:type="spellStart"/>
+      <w:r>
+        <w:rPr>
+          <w:rStyle w:val="Strong"/>
+        </w:rPr>
+        <w:t>nahi</w:t>
+      </w:r>
+      <w:proofErr w:type="spellEnd"/>
+      <w:r>
+        <w:rPr>
+          <w:rStyle w:val="Strong"/>
+        </w:rPr>
+        <w:t xml:space="preserve"> </w:t>
+      </w:r>
+      <w:proofErr w:type="spellStart"/>
+      <w:r>
+        <w:rPr>
+          <w:rStyle w:val="Strong"/>
+        </w:rPr>
+        <w:t>hai</w:t>
+      </w:r>
+      <w:proofErr w:type="spellEnd"/>
+      <w:r>
+        <w:rPr>
+          <w:rStyle w:val="Strong"/>
+        </w:rPr>
+        <w:t xml:space="preserve"> — </w:t>
+      </w:r>
+      <w:proofErr w:type="spellStart"/>
+      <w:r>
+        <w:rPr>
+          <w:rStyle w:val="Strong"/>
+        </w:rPr>
+        <w:t>unke</w:t>
+      </w:r>
+      <w:proofErr w:type="spellEnd"/>
+      <w:r>
+        <w:rPr>
+          <w:rStyle w:val="Strong"/>
+        </w:rPr>
+        <w:t xml:space="preserve"> concepts aur code confidently </w:t>
+      </w:r>
+      <w:proofErr w:type="spellStart"/>
+      <w:r>
+        <w:rPr>
+          <w:rStyle w:val="Strong"/>
+        </w:rPr>
+        <w:t>kar</w:t>
+      </w:r>
+      <w:proofErr w:type="spellEnd"/>
+      <w:r>
+        <w:rPr>
+          <w:rStyle w:val="Strong"/>
+        </w:rPr>
+        <w:t xml:space="preserve"> </w:t>
+      </w:r>
+      <w:proofErr w:type="spellStart"/>
+      <w:r>
+        <w:rPr>
+          <w:rStyle w:val="Strong"/>
+        </w:rPr>
+        <w:t>paana</w:t>
+      </w:r>
+      <w:proofErr w:type="spellEnd"/>
+      <w:r>
+        <w:rPr>
+          <w:rStyle w:val="Strong"/>
+        </w:rPr>
+        <w:t xml:space="preserve"> </w:t>
+      </w:r>
+      <w:proofErr w:type="spellStart"/>
+      <w:r>
+        <w:rPr>
+          <w:rStyle w:val="Strong"/>
+        </w:rPr>
+        <w:t>chahiye</w:t>
+      </w:r>
+      <w:proofErr w:type="spellEnd"/>
+      <w:r>
+        <w:rPr>
+          <w:rStyle w:val="Strong"/>
+        </w:rPr>
+        <w:t>.</w:t>
+      </w:r>
+    </w:p>
+    <w:p>
+      <w:pPr>
+        <w:pStyle w:val="NormalWeb"/>
+      </w:pPr>
+      <w:proofErr w:type="spellStart"/>
       <w:r>
         <w:lastRenderedPageBreak/>
-        <w:t>Tumhare liye final scope lock samjho:</w:t>
+        <w:t>Tumhare</w:t>
+      </w:r>
+      <w:proofErr w:type="spellEnd"/>
+      <w:r>
+        <w:t xml:space="preserve"> </w:t>
+      </w:r>
+      <w:proofErr w:type="spellStart"/>
+      <w:r>
+        <w:t>liye</w:t>
+      </w:r>
+      <w:proofErr w:type="spellEnd"/>
+      <w:r>
+        <w:t xml:space="preserve"> final scope lock </w:t>
+      </w:r>
+      <w:proofErr w:type="spellStart"/>
+      <w:r>
+        <w:t>samjho</w:t>
+      </w:r>
+      <w:proofErr w:type="spellEnd"/>
+      <w:r>
+        <w:t>:</w:t>
       </w:r>
     </w:p>
     <w:p>
@@ -5720,8 +7349,30 @@
         <w:rPr>
           <w:rStyle w:val="Strong"/>
         </w:rPr>
-        <w:t>Tier 2 DSA ko abhi side me rakho</w:t>
-      </w:r>
+        <w:t xml:space="preserve">Tier 2 DSA ko </w:t>
+      </w:r>
+      <w:proofErr w:type="spellStart"/>
+      <w:r>
+        <w:rPr>
+          <w:rStyle w:val="Strong"/>
+        </w:rPr>
+        <w:t>abhi</w:t>
+      </w:r>
+      <w:proofErr w:type="spellEnd"/>
+      <w:r>
+        <w:rPr>
+          <w:rStyle w:val="Strong"/>
+        </w:rPr>
+        <w:t xml:space="preserve"> side me </w:t>
+      </w:r>
+      <w:proofErr w:type="spellStart"/>
+      <w:r>
+        <w:rPr>
+          <w:rStyle w:val="Strong"/>
+        </w:rPr>
+        <w:t>rakho</w:t>
+      </w:r>
+      <w:proofErr w:type="spellEnd"/>
       <w:r>
         <w:t>.</w:t>
       </w:r>
@@ -5739,22 +7390,200 @@
         <w:pStyle w:val="NormalWeb"/>
       </w:pPr>
       <w:r>
-        <w:t>110 questions ko bhi 110 independent topics mat samajhna. Hum karte-karte patterns cover karenge. Agar ek question se concept properly samajh aa gaya, uske 4 similar questions ratne ki zaroorat nahi.</w:t>
-      </w:r>
-    </w:p>
-    <w:p>
-      <w:pPr>
-        <w:pStyle w:val="NormalWeb"/>
-      </w:pPr>
-      <w:r>
-        <w:rPr>
-          <w:rStyle w:val="Strong"/>
-        </w:rPr>
-        <w:t>So haan bhai, tum mere bharose ye scope follow kar sakte ho. Main unnecessary cheezein add nahi karunga.</w:t>
-      </w:r>
+        <w:t xml:space="preserve">110 questions ko </w:t>
+      </w:r>
+      <w:proofErr w:type="spellStart"/>
+      <w:r>
+        <w:t>bhi</w:t>
+      </w:r>
+      <w:proofErr w:type="spellEnd"/>
+      <w:r>
+        <w:t xml:space="preserve"> 110 independent topics mat </w:t>
+      </w:r>
+      <w:proofErr w:type="spellStart"/>
+      <w:r>
+        <w:t>samajhna</w:t>
+      </w:r>
+      <w:proofErr w:type="spellEnd"/>
+      <w:r>
+        <w:t xml:space="preserve">. Hum </w:t>
+      </w:r>
+      <w:proofErr w:type="spellStart"/>
+      <w:r>
+        <w:t>karte-karte</w:t>
+      </w:r>
+      <w:proofErr w:type="spellEnd"/>
+      <w:r>
+        <w:t xml:space="preserve"> patterns cover </w:t>
+      </w:r>
+      <w:proofErr w:type="spellStart"/>
+      <w:r>
+        <w:t>karenge</w:t>
+      </w:r>
+      <w:proofErr w:type="spellEnd"/>
+      <w:r>
+        <w:t xml:space="preserve">. Agar ek question se concept properly </w:t>
+      </w:r>
+      <w:proofErr w:type="spellStart"/>
+      <w:r>
+        <w:t>samajh</w:t>
+      </w:r>
+      <w:proofErr w:type="spellEnd"/>
+      <w:r>
+        <w:t xml:space="preserve"> aa </w:t>
+      </w:r>
+      <w:proofErr w:type="spellStart"/>
+      <w:r>
+        <w:t>gaya</w:t>
+      </w:r>
+      <w:proofErr w:type="spellEnd"/>
+      <w:r>
+        <w:t xml:space="preserve">, </w:t>
+      </w:r>
+      <w:proofErr w:type="spellStart"/>
+      <w:r>
+        <w:t>uske</w:t>
+      </w:r>
+      <w:proofErr w:type="spellEnd"/>
+      <w:r>
+        <w:t xml:space="preserve"> 4 similar questions </w:t>
+      </w:r>
+      <w:proofErr w:type="spellStart"/>
+      <w:r>
+        <w:t>ratne</w:t>
+      </w:r>
+      <w:proofErr w:type="spellEnd"/>
+      <w:r>
+        <w:t xml:space="preserve"> ki </w:t>
+      </w:r>
+      <w:proofErr w:type="spellStart"/>
+      <w:r>
+        <w:t>zaroorat</w:t>
+      </w:r>
+      <w:proofErr w:type="spellEnd"/>
       <w:r>
         <w:t xml:space="preserve"> </w:t>
       </w:r>
+      <w:proofErr w:type="spellStart"/>
+      <w:r>
+        <w:t>nahi</w:t>
+      </w:r>
+      <w:proofErr w:type="spellEnd"/>
+      <w:r>
+        <w:t>.</w:t>
+      </w:r>
+    </w:p>
+    <w:p>
+      <w:pPr>
+        <w:pStyle w:val="NormalWeb"/>
+      </w:pPr>
+      <w:r>
+        <w:rPr>
+          <w:rStyle w:val="Strong"/>
+        </w:rPr>
+        <w:t xml:space="preserve">So </w:t>
+      </w:r>
+      <w:proofErr w:type="spellStart"/>
+      <w:r>
+        <w:rPr>
+          <w:rStyle w:val="Strong"/>
+        </w:rPr>
+        <w:t>haan</w:t>
+      </w:r>
+      <w:proofErr w:type="spellEnd"/>
+      <w:r>
+        <w:rPr>
+          <w:rStyle w:val="Strong"/>
+        </w:rPr>
+        <w:t xml:space="preserve"> bhai, tum mere </w:t>
+      </w:r>
+      <w:proofErr w:type="spellStart"/>
+      <w:r>
+        <w:rPr>
+          <w:rStyle w:val="Strong"/>
+        </w:rPr>
+        <w:t>bharose</w:t>
+      </w:r>
+      <w:proofErr w:type="spellEnd"/>
+      <w:r>
+        <w:rPr>
+          <w:rStyle w:val="Strong"/>
+        </w:rPr>
+        <w:t xml:space="preserve"> ye scope follow </w:t>
+      </w:r>
+      <w:proofErr w:type="spellStart"/>
+      <w:r>
+        <w:rPr>
+          <w:rStyle w:val="Strong"/>
+        </w:rPr>
+        <w:t>kar</w:t>
+      </w:r>
+      <w:proofErr w:type="spellEnd"/>
+      <w:r>
+        <w:rPr>
+          <w:rStyle w:val="Strong"/>
+        </w:rPr>
+        <w:t xml:space="preserve"> </w:t>
+      </w:r>
+      <w:proofErr w:type="spellStart"/>
+      <w:r>
+        <w:rPr>
+          <w:rStyle w:val="Strong"/>
+        </w:rPr>
+        <w:t>sakte</w:t>
+      </w:r>
+      <w:proofErr w:type="spellEnd"/>
+      <w:r>
+        <w:rPr>
+          <w:rStyle w:val="Strong"/>
+        </w:rPr>
+        <w:t xml:space="preserve"> ho. Main unnecessary </w:t>
+      </w:r>
+      <w:proofErr w:type="spellStart"/>
+      <w:r>
+        <w:rPr>
+          <w:rStyle w:val="Strong"/>
+        </w:rPr>
+        <w:t>cheezein</w:t>
+      </w:r>
+      <w:proofErr w:type="spellEnd"/>
+      <w:r>
+        <w:rPr>
+          <w:rStyle w:val="Strong"/>
+        </w:rPr>
+        <w:t xml:space="preserve"> add </w:t>
+      </w:r>
+      <w:proofErr w:type="spellStart"/>
+      <w:r>
+        <w:rPr>
+          <w:rStyle w:val="Strong"/>
+        </w:rPr>
+        <w:t>nahi</w:t>
+      </w:r>
+      <w:proofErr w:type="spellEnd"/>
+      <w:r>
+        <w:rPr>
+          <w:rStyle w:val="Strong"/>
+        </w:rPr>
+        <w:t xml:space="preserve"> </w:t>
+      </w:r>
+      <w:proofErr w:type="spellStart"/>
+      <w:r>
+        <w:rPr>
+          <w:rStyle w:val="Strong"/>
+        </w:rPr>
+        <w:t>karunga</w:t>
+      </w:r>
+      <w:proofErr w:type="spellEnd"/>
+      <w:r>
+        <w:rPr>
+          <w:rStyle w:val="Strong"/>
+        </w:rPr>
+        <w:t>.</w:t>
+      </w:r>
+      <w:r>
+        <w:t xml:space="preserve"> </w:t>
+      </w:r>
       <w:r>
         <w:rPr>
           <w:rFonts w:ascii="Segoe UI Emoji" w:hAnsi="Segoe UI Emoji" w:cs="Segoe UI Emoji"/>
@@ -5767,7 +7596,23 @@
         <w:pStyle w:val="NormalWeb"/>
       </w:pPr>
       <w:r>
-        <w:t xml:space="preserve">Ab jab Core Python start karenge, main isi list se </w:t>
+        <w:t xml:space="preserve">Ab jab Core Python start </w:t>
+      </w:r>
+      <w:proofErr w:type="spellStart"/>
+      <w:r>
+        <w:t>karenge</w:t>
+      </w:r>
+      <w:proofErr w:type="spellEnd"/>
+      <w:r>
+        <w:t xml:space="preserve">, main </w:t>
+      </w:r>
+      <w:proofErr w:type="spellStart"/>
+      <w:r>
+        <w:t>isi</w:t>
+      </w:r>
+      <w:proofErr w:type="spellEnd"/>
+      <w:r>
+        <w:t xml:space="preserve"> list se </w:t>
       </w:r>
       <w:r>
         <w:rPr>
@@ -5776,13 +7621,143 @@
         <w:t>interview-priority order</w:t>
       </w:r>
       <w:r>
-        <w:t xml:space="preserve"> me questions dunga—aur har question ko waise hi deeply dry-run karwaunga jaise hum DSA kar rahe hain.</w:t>
-      </w:r>
-    </w:p>
-    <w:p>
-      <w:r>
-        <w:t>isme numbers waale ques ni hai wo ni aaenge jaise febonacci pallindrome happy number wagar</w:t>
-      </w:r>
+        <w:t xml:space="preserve"> me questions </w:t>
+      </w:r>
+      <w:proofErr w:type="spellStart"/>
+      <w:r>
+        <w:t>dunga</w:t>
+      </w:r>
+      <w:proofErr w:type="spellEnd"/>
+      <w:r>
+        <w:t xml:space="preserve">—aur </w:t>
+      </w:r>
+      <w:proofErr w:type="spellStart"/>
+      <w:r>
+        <w:t>har</w:t>
+      </w:r>
+      <w:proofErr w:type="spellEnd"/>
+      <w:r>
+        <w:t xml:space="preserve"> question ko </w:t>
+      </w:r>
+      <w:proofErr w:type="spellStart"/>
+      <w:r>
+        <w:t>waise</w:t>
+      </w:r>
+      <w:proofErr w:type="spellEnd"/>
+      <w:r>
+        <w:t xml:space="preserve"> hi deeply dry-run </w:t>
+      </w:r>
+      <w:proofErr w:type="spellStart"/>
+      <w:r>
+        <w:t>karwaunga</w:t>
+      </w:r>
+      <w:proofErr w:type="spellEnd"/>
+      <w:r>
+        <w:t xml:space="preserve"> </w:t>
+      </w:r>
+      <w:proofErr w:type="spellStart"/>
+      <w:r>
+        <w:t>jaise</w:t>
+      </w:r>
+      <w:proofErr w:type="spellEnd"/>
+      <w:r>
+        <w:t xml:space="preserve"> hum DSA </w:t>
+      </w:r>
+      <w:proofErr w:type="spellStart"/>
+      <w:r>
+        <w:t>kar</w:t>
+      </w:r>
+      <w:proofErr w:type="spellEnd"/>
+      <w:r>
+        <w:t xml:space="preserve"> </w:t>
+      </w:r>
+      <w:proofErr w:type="spellStart"/>
+      <w:r>
+        <w:t>rahe</w:t>
+      </w:r>
+      <w:proofErr w:type="spellEnd"/>
+      <w:r>
+        <w:t xml:space="preserve"> hain.</w:t>
+      </w:r>
+    </w:p>
+    <w:p>
+      <w:proofErr w:type="spellStart"/>
+      <w:r>
+        <w:t>isme</w:t>
+      </w:r>
+      <w:proofErr w:type="spellEnd"/>
+      <w:r>
+        <w:t xml:space="preserve"> numbers </w:t>
+      </w:r>
+      <w:proofErr w:type="spellStart"/>
+      <w:r>
+        <w:t>waale</w:t>
+      </w:r>
+      <w:proofErr w:type="spellEnd"/>
+      <w:r>
+        <w:t xml:space="preserve"> ques </w:t>
+      </w:r>
+      <w:proofErr w:type="spellStart"/>
+      <w:r>
+        <w:t>ni</w:t>
+      </w:r>
+      <w:proofErr w:type="spellEnd"/>
+      <w:r>
+        <w:t xml:space="preserve"> </w:t>
+      </w:r>
+      <w:proofErr w:type="spellStart"/>
+      <w:r>
+        <w:t>hai</w:t>
+      </w:r>
+      <w:proofErr w:type="spellEnd"/>
+      <w:r>
+        <w:t xml:space="preserve"> wo </w:t>
+      </w:r>
+      <w:proofErr w:type="spellStart"/>
+      <w:r>
+        <w:t>ni</w:t>
+      </w:r>
+      <w:proofErr w:type="spellEnd"/>
+      <w:r>
+        <w:t xml:space="preserve"> </w:t>
+      </w:r>
+      <w:proofErr w:type="spellStart"/>
+      <w:r>
+        <w:t>aaenge</w:t>
+      </w:r>
+      <w:proofErr w:type="spellEnd"/>
+      <w:r>
+        <w:t xml:space="preserve"> </w:t>
+      </w:r>
+      <w:proofErr w:type="spellStart"/>
+      <w:r>
+        <w:t>jaise</w:t>
+      </w:r>
+      <w:proofErr w:type="spellEnd"/>
+      <w:r>
+        <w:t xml:space="preserve"> </w:t>
+      </w:r>
+      <w:proofErr w:type="spellStart"/>
+      <w:r>
+        <w:t>febonacci</w:t>
+      </w:r>
+      <w:proofErr w:type="spellEnd"/>
+      <w:r>
+        <w:t xml:space="preserve"> </w:t>
+      </w:r>
+      <w:proofErr w:type="spellStart"/>
+      <w:r>
+        <w:t>pallindrome</w:t>
+      </w:r>
+      <w:proofErr w:type="spellEnd"/>
+      <w:r>
+        <w:t xml:space="preserve"> happy number </w:t>
+      </w:r>
+      <w:proofErr w:type="spellStart"/>
+      <w:r>
+        <w:t>wagar</w:t>
+      </w:r>
+      <w:proofErr w:type="spellEnd"/>
     </w:p>
     <w:p>
       <w:pPr>
@@ -5795,10 +7770,46 @@
         <w:rPr>
           <w:rStyle w:val="Strong"/>
         </w:rPr>
-        <w:t>numbers wale questions bhi aa sakte hain</w:t>
-      </w:r>
-      <w:r>
-        <w:t xml:space="preserve"> — jaise:</w:t>
+        <w:t xml:space="preserve">numbers wale questions </w:t>
+      </w:r>
+      <w:proofErr w:type="spellStart"/>
+      <w:r>
+        <w:rPr>
+          <w:rStyle w:val="Strong"/>
+        </w:rPr>
+        <w:t>bhi</w:t>
+      </w:r>
+      <w:proofErr w:type="spellEnd"/>
+      <w:r>
+        <w:rPr>
+          <w:rStyle w:val="Strong"/>
+        </w:rPr>
+        <w:t xml:space="preserve"> aa </w:t>
+      </w:r>
+      <w:proofErr w:type="spellStart"/>
+      <w:r>
+        <w:rPr>
+          <w:rStyle w:val="Strong"/>
+        </w:rPr>
+        <w:t>sakte</w:t>
+      </w:r>
+      <w:proofErr w:type="spellEnd"/>
+      <w:r>
+        <w:rPr>
+          <w:rStyle w:val="Strong"/>
+        </w:rPr>
+        <w:t xml:space="preserve"> hain</w:t>
+      </w:r>
+      <w:r>
+        <w:t xml:space="preserve"> — </w:t>
+      </w:r>
+      <w:proofErr w:type="spellStart"/>
+      <w:r>
+        <w:t>jaise</w:t>
+      </w:r>
+      <w:proofErr w:type="spellEnd"/>
+      <w:r>
+        <w:t>:</w:t>
       </w:r>
     </w:p>
     <w:p>
@@ -5962,7 +7973,15 @@
         <w:pStyle w:val="NormalWeb"/>
       </w:pPr>
       <w:r>
-        <w:t xml:space="preserve">Aur ek correction meri previous list me: maine </w:t>
+        <w:t xml:space="preserve">Aur ek correction meri previous list me: </w:t>
+      </w:r>
+      <w:proofErr w:type="spellStart"/>
+      <w:r>
+        <w:t>maine</w:t>
+      </w:r>
+      <w:proofErr w:type="spellEnd"/>
+      <w:r>
+        <w:t xml:space="preserve"> </w:t>
       </w:r>
       <w:r>
         <w:rPr>
@@ -5971,14 +7990,66 @@
         <w:t>Fibonacci aur factorial</w:t>
       </w:r>
       <w:r>
-        <w:t xml:space="preserve"> include kiye the, lekin </w:t>
-      </w:r>
-      <w:r>
-        <w:rPr>
-          <w:rStyle w:val="Strong"/>
-        </w:rPr>
-        <w:t>number-based questions ka dedicated section nahi diya tha</w:t>
-      </w:r>
+        <w:t xml:space="preserve"> include </w:t>
+      </w:r>
+      <w:proofErr w:type="spellStart"/>
+      <w:r>
+        <w:t>kiye</w:t>
+      </w:r>
+      <w:proofErr w:type="spellEnd"/>
+      <w:r>
+        <w:t xml:space="preserve"> the, </w:t>
+      </w:r>
+      <w:proofErr w:type="spellStart"/>
+      <w:r>
+        <w:t>lekin</w:t>
+      </w:r>
+      <w:proofErr w:type="spellEnd"/>
+      <w:r>
+        <w:t xml:space="preserve"> </w:t>
+      </w:r>
+      <w:r>
+        <w:rPr>
+          <w:rStyle w:val="Strong"/>
+        </w:rPr>
+        <w:t xml:space="preserve">number-based questions ka dedicated section </w:t>
+      </w:r>
+      <w:proofErr w:type="spellStart"/>
+      <w:r>
+        <w:rPr>
+          <w:rStyle w:val="Strong"/>
+        </w:rPr>
+        <w:t>nahi</w:t>
+      </w:r>
+      <w:proofErr w:type="spellEnd"/>
+      <w:r>
+        <w:rPr>
+          <w:rStyle w:val="Strong"/>
+        </w:rPr>
+        <w:t xml:space="preserve"> </w:t>
+      </w:r>
+      <w:proofErr w:type="spellStart"/>
+      <w:r>
+        <w:rPr>
+          <w:rStyle w:val="Strong"/>
+        </w:rPr>
+        <w:t>diya</w:t>
+      </w:r>
+      <w:proofErr w:type="spellEnd"/>
+      <w:r>
+        <w:rPr>
+          <w:rStyle w:val="Strong"/>
+        </w:rPr>
+        <w:t xml:space="preserve"> </w:t>
+      </w:r>
+      <w:proofErr w:type="spellStart"/>
+      <w:r>
+        <w:rPr>
+          <w:rStyle w:val="Strong"/>
+        </w:rPr>
+        <w:t>tha</w:t>
+      </w:r>
+      <w:proofErr w:type="spellEnd"/>
       <w:r>
         <w:t>.</w:t>
       </w:r>
@@ -5988,8 +8059,21 @@
         <w:pStyle w:val="Heading3"/>
       </w:pPr>
       <w:r>
-        <w:t>Tere 6 LPA target ke liye</w:t>
-      </w:r>
+        <w:t xml:space="preserve">Tere 6 LPA target </w:t>
+      </w:r>
+      <w:proofErr w:type="spellStart"/>
+      <w:r>
+        <w:t>ke</w:t>
+      </w:r>
+      <w:proofErr w:type="spellEnd"/>
+      <w:r>
+        <w:t xml:space="preserve"> </w:t>
+      </w:r>
+      <w:proofErr w:type="spellStart"/>
+      <w:r>
+        <w:t>liye</w:t>
+      </w:r>
+      <w:proofErr w:type="spellEnd"/>
     </w:p>
     <w:p>
       <w:pPr>
@@ -5998,14 +8082,52 @@
       <w:r>
         <w:t xml:space="preserve">Main numbers wale </w:t>
       </w:r>
-      <w:r>
-        <w:rPr>
-          <w:rStyle w:val="Strong"/>
-        </w:rPr>
-        <w:t>saare random 50 questions nahi karwaunga</w:t>
-      </w:r>
-      <w:r>
-        <w:t>. Bas interview-useful set add karenge:</w:t>
+      <w:proofErr w:type="spellStart"/>
+      <w:r>
+        <w:rPr>
+          <w:rStyle w:val="Strong"/>
+        </w:rPr>
+        <w:t>saare</w:t>
+      </w:r>
+      <w:proofErr w:type="spellEnd"/>
+      <w:r>
+        <w:rPr>
+          <w:rStyle w:val="Strong"/>
+        </w:rPr>
+        <w:t xml:space="preserve"> random 50 questions </w:t>
+      </w:r>
+      <w:proofErr w:type="spellStart"/>
+      <w:r>
+        <w:rPr>
+          <w:rStyle w:val="Strong"/>
+        </w:rPr>
+        <w:t>nahi</w:t>
+      </w:r>
+      <w:proofErr w:type="spellEnd"/>
+      <w:r>
+        <w:rPr>
+          <w:rStyle w:val="Strong"/>
+        </w:rPr>
+        <w:t xml:space="preserve"> </w:t>
+      </w:r>
+      <w:proofErr w:type="spellStart"/>
+      <w:r>
+        <w:rPr>
+          <w:rStyle w:val="Strong"/>
+        </w:rPr>
+        <w:t>karwaunga</w:t>
+      </w:r>
+      <w:proofErr w:type="spellEnd"/>
+      <w:r>
+        <w:t xml:space="preserve">. Bas interview-useful set add </w:t>
+      </w:r>
+      <w:proofErr w:type="spellStart"/>
+      <w:r>
+        <w:t>karenge</w:t>
+      </w:r>
+      <w:proofErr w:type="spellEnd"/>
+      <w:r>
+        <w:t>:</w:t>
       </w:r>
     </w:p>
     <w:p>

</xml_diff>